<commit_message>
Creación carpeta fase 2.2
- Se elimina documento duplicado de "Especificaciones técnicas, tecnologías, estructura del proyecto y estándares de programación"
- Se crea carpeta Fase 2.2
- Se agrega carpeta "Evaluaciones" donde se adjunta el documento de evaluación de la fase 1
</commit_message>
<xml_diff>
--- a/docs/Documentos Fase 2.1/6- Especificaciones técnicas/6- Documento_de_Desarrollo_CultureGo.docx
+++ b/docs/Documentos Fase 2.1/6- Especificaciones técnicas/6- Documento_de_Desarrollo_CultureGo.docx
@@ -221,7 +221,7 @@
           <w:szCs w:val="30"/>
           <w:rtl w:val="0"/>
         </w:rPr>
-        <w:t xml:space="preserve">Fecha: 2</w:t>
+        <w:t xml:space="preserve">Fecha: 1</w:t>
       </w:r>
       <w:r>
         <w:rPr>
@@ -233,7 +233,7 @@
           <w:szCs w:val="30"/>
           <w:rtl w:val="0"/>
         </w:rPr>
-        <w:t xml:space="preserve">8</w:t>
+        <w:t xml:space="preserve">1</w:t>
       </w:r>
       <w:r>
         <w:rPr>
@@ -246,7 +246,7 @@
           <w:szCs w:val="30"/>
           <w:rtl w:val="0"/>
         </w:rPr>
-        <w:t xml:space="preserve">/09/2026</w:t>
+        <w:t xml:space="preserve">/10/2026</w:t>
       </w:r>
       <w:r>
         <w:rPr>
@@ -292,7 +292,7 @@
     </w:p>
     <w:sdt>
       <w:sdtPr>
-        <w:id w:val="-1171734857"/>
+        <w:id w:val="1880238952"/>
         <w:docPartObj>
           <w:docPartGallery w:val="Table of Contents"/>
           <w:docPartUnique w:val="1"/>
@@ -1087,7 +1087,7 @@
               </w:rPr>
               <w:t xml:space="preserve">3. Definición de tecnologías y herramientas utilizadas</w:t>
               <w:tab/>
-              <w:t xml:space="preserve">7</w:t>
+              <w:t xml:space="preserve">8</w:t>
             </w:r>
           </w:hyperlink>
           <w:r>
@@ -1140,7 +1140,7 @@
               </w:rPr>
               <w:t xml:space="preserve">3.1 Tecnologías de desarrollo</w:t>
               <w:tab/>
-              <w:t xml:space="preserve">7</w:t>
+              <w:t xml:space="preserve">8</w:t>
             </w:r>
           </w:hyperlink>
           <w:r>
@@ -1193,7 +1193,7 @@
               </w:rPr>
               <w:t xml:space="preserve">3.2 Herramientas de apoyo</w:t>
               <w:tab/>
-              <w:t xml:space="preserve">8</w:t>
+              <w:t xml:space="preserve">9</w:t>
             </w:r>
           </w:hyperlink>
           <w:r>
@@ -1246,7 +1246,7 @@
               </w:rPr>
               <w:t xml:space="preserve">3.3 Decisiones tecnológicas relevantes</w:t>
               <w:tab/>
-              <w:t xml:space="preserve">8</w:t>
+              <w:t xml:space="preserve">9</w:t>
             </w:r>
           </w:hyperlink>
           <w:r>
@@ -1299,7 +1299,7 @@
               </w:rPr>
               <w:t xml:space="preserve">Backend como servicio en lugar de servidor propio</w:t>
               <w:tab/>
-              <w:t xml:space="preserve">8</w:t>
+              <w:t xml:space="preserve">9</w:t>
             </w:r>
           </w:hyperlink>
           <w:r>
@@ -1352,7 +1352,7 @@
               </w:rPr>
               <w:t xml:space="preserve">Aplicación híbrida en lugar de desarrollo nativo</w:t>
               <w:tab/>
-              <w:t xml:space="preserve">8</w:t>
+              <w:t xml:space="preserve">9</w:t>
             </w:r>
           </w:hyperlink>
           <w:r>
@@ -1405,7 +1405,7 @@
               </w:rPr>
               <w:t xml:space="preserve">Leaflet con OpenStreetMap en lugar de un proveedor comercial</w:t>
               <w:tab/>
-              <w:t xml:space="preserve">8</w:t>
+              <w:t xml:space="preserve">9</w:t>
             </w:r>
           </w:hyperlink>
           <w:r>
@@ -1458,7 +1458,7 @@
               </w:rPr>
               <w:t xml:space="preserve">Lógica de negocio en la base de datos</w:t>
               <w:tab/>
-              <w:t xml:space="preserve">8</w:t>
+              <w:t xml:space="preserve">9</w:t>
             </w:r>
           </w:hyperlink>
           <w:r>
@@ -1510,7 +1510,7 @@
               </w:rPr>
               <w:t xml:space="preserve">4. Estructura del proyecto</w:t>
               <w:tab/>
-              <w:t xml:space="preserve">9</w:t>
+              <w:t xml:space="preserve">10</w:t>
             </w:r>
           </w:hyperlink>
           <w:r>
@@ -1563,7 +1563,7 @@
               </w:rPr>
               <w:t xml:space="preserve">4.1 Organización de carpetas del cliente</w:t>
               <w:tab/>
-              <w:t xml:space="preserve">9</w:t>
+              <w:t xml:space="preserve">10</w:t>
             </w:r>
           </w:hyperlink>
           <w:r>
@@ -1616,7 +1616,7 @@
               </w:rPr>
               <w:t xml:space="preserve">4.2 Navegación y rutas</w:t>
               <w:tab/>
-              <w:t xml:space="preserve">9</w:t>
+              <w:t xml:space="preserve">11</w:t>
             </w:r>
           </w:hyperlink>
           <w:r>
@@ -1669,7 +1669,7 @@
               </w:rPr>
               <w:t xml:space="preserve">4.3 Estructura del backend</w:t>
               <w:tab/>
-              <w:t xml:space="preserve">10</w:t>
+              <w:t xml:space="preserve">11</w:t>
             </w:r>
           </w:hyperlink>
           <w:r>
@@ -1722,7 +1722,7 @@
               </w:rPr>
               <w:t xml:space="preserve">4.4 Estructura del repositorio</w:t>
               <w:tab/>
-              <w:t xml:space="preserve">10</w:t>
+              <w:t xml:space="preserve">12</w:t>
             </w:r>
           </w:hyperlink>
           <w:r>
@@ -1774,7 +1774,7 @@
               </w:rPr>
               <w:t xml:space="preserve">5. Estándares y convenciones de programación</w:t>
               <w:tab/>
-              <w:t xml:space="preserve">11</w:t>
+              <w:t xml:space="preserve">12</w:t>
             </w:r>
           </w:hyperlink>
           <w:r>
@@ -1827,7 +1827,7 @@
               </w:rPr>
               <w:t xml:space="preserve">5.1 Convenciones de nombres</w:t>
               <w:tab/>
-              <w:t xml:space="preserve">11</w:t>
+              <w:t xml:space="preserve">12</w:t>
             </w:r>
           </w:hyperlink>
           <w:r>
@@ -1880,7 +1880,7 @@
               </w:rPr>
               <w:t xml:space="preserve">5.2 Convenciones de Angular e Ionic</w:t>
               <w:tab/>
-              <w:t xml:space="preserve">11</w:t>
+              <w:t xml:space="preserve">13</w:t>
             </w:r>
           </w:hyperlink>
           <w:r>
@@ -1933,7 +1933,7 @@
               </w:rPr>
               <w:t xml:space="preserve">5.3 Estilos e identidad visual</w:t>
               <w:tab/>
-              <w:t xml:space="preserve">12</w:t>
+              <w:t xml:space="preserve">13</w:t>
             </w:r>
           </w:hyperlink>
           <w:r>
@@ -1986,7 +1986,7 @@
               </w:rPr>
               <w:t xml:space="preserve">5.4 Manejo de errores</w:t>
               <w:tab/>
-              <w:t xml:space="preserve">12</w:t>
+              <w:t xml:space="preserve">14</w:t>
             </w:r>
           </w:hyperlink>
           <w:r>
@@ -2039,7 +2039,7 @@
               </w:rPr>
               <w:t xml:space="preserve">5.5 Seguridad en el código</w:t>
               <w:tab/>
-              <w:t xml:space="preserve">13</w:t>
+              <w:t xml:space="preserve">14</w:t>
             </w:r>
           </w:hyperlink>
           <w:r>
@@ -2092,7 +2092,7 @@
               </w:rPr>
               <w:t xml:space="preserve">5.6 Convenciones de control de versiones</w:t>
               <w:tab/>
-              <w:t xml:space="preserve">13</w:t>
+              <w:t xml:space="preserve">14</w:t>
             </w:r>
           </w:hyperlink>
           <w:r>
@@ -2145,7 +2145,7 @@
               </w:rPr>
               <w:t xml:space="preserve">5.7 Documentación y limpieza del código</w:t>
               <w:tab/>
-              <w:t xml:space="preserve">13</w:t>
+              <w:t xml:space="preserve">15</w:t>
             </w:r>
           </w:hyperlink>
           <w:r>
@@ -2198,7 +2198,7 @@
               </w:rPr>
               <w:t xml:space="preserve">5.8 Definición de terminado</w:t>
               <w:tab/>
-              <w:t xml:space="preserve">13</w:t>
+              <w:t xml:space="preserve">15</w:t>
             </w:r>
           </w:hyperlink>
           <w:r>
@@ -2250,7 +2250,7 @@
               </w:rPr>
               <w:t xml:space="preserve">6. Anexos</w:t>
               <w:tab/>
-              <w:t xml:space="preserve">14</w:t>
+              <w:t xml:space="preserve">15</w:t>
             </w:r>
           </w:hyperlink>
           <w:r>
@@ -2303,7 +2303,7 @@
               </w:rPr>
               <w:t xml:space="preserve">Anexo A. Configuración del entorno de un integrante nuevo</w:t>
               <w:tab/>
-              <w:t xml:space="preserve">14</w:t>
+              <w:t xml:space="preserve">15</w:t>
             </w:r>
           </w:hyperlink>
           <w:r>
@@ -2356,7 +2356,7 @@
               </w:rPr>
               <w:t xml:space="preserve">Anexo B. Trazabilidad con los requisitos no funcionales</w:t>
               <w:tab/>
-              <w:t xml:space="preserve">14</w:t>
+              <w:t xml:space="preserve">16</w:t>
             </w:r>
           </w:hyperlink>
           <w:r>
@@ -2650,6 +2650,11 @@
         </w:rPr>
         <w:t xml:space="preserve">Precisa la línea base técnica del producto: qué se construye, con qué tecnologías y bajo qué restricciones. Todo cambio tecnológico posterior debe tramitarse como solicitud de cambio (restricción C-04).</w:t>
       </w:r>
+      <w:r>
+        <w:rPr>
+          <w:rtl w:val="0"/>
+        </w:rPr>
+      </w:r>
     </w:p>
     <w:p>
       <w:pPr>
@@ -2710,7 +2715,12 @@
           <w:vertAlign w:val="baseline"/>
           <w:rtl w:val="0"/>
         </w:rPr>
-        <w:t xml:space="preserve">Las convenciones de programación y la definición de terminado son los criterios de calidad del proceso de construcción, y dan cumplimiento verificable a RNF-10 (mantenibilidad) y RNF-11 (portabilidad).</w:t>
+        <w:t xml:space="preserve">Las convenciones de programación y la definición de terminado son los criterios de calidad del proceso de construcción, y dan cumplimiento verificable a RNF-10 (mantenibilidad).</w:t>
+      </w:r>
+      <w:r>
+        <w:rPr>
+          <w:rtl w:val="0"/>
+        </w:rPr>
       </w:r>
     </w:p>
     <w:p>
@@ -2774,6 +2784,11 @@
         </w:rPr>
         <w:t xml:space="preserve">Documentar el entorno, las credenciales y las convenciones mitiga los riesgos R-10 (indisponibilidad de un integrante) y R-11 (pérdida o desconfiguración de credenciales) del registro de riesgos.</w:t>
       </w:r>
+      <w:r>
+        <w:rPr>
+          <w:rtl w:val="0"/>
+        </w:rPr>
+      </w:r>
     </w:p>
     <w:p>
       <w:pPr>
@@ -2839,7 +2854,12 @@
           <w:vertAlign w:val="baseline"/>
           <w:rtl w:val="0"/>
         </w:rPr>
-        <w:t xml:space="preserve">Especificación de Requisitos de Software CultureGo (RF-01 a RF-27, RNF-01 a RNF-19).</w:t>
+        <w:t xml:space="preserve">Especificación de Requisitos de Software CultureGo v1.1 (RF-01 a RF-27 y RNF-01 a RNF-15, sin RNF-11 ni RNF-14).</w:t>
+      </w:r>
+      <w:r>
+        <w:rPr>
+          <w:rtl w:val="0"/>
+        </w:rPr>
       </w:r>
     </w:p>
     <w:p>
@@ -2884,6 +2904,11 @@
         </w:rPr>
         <w:t xml:space="preserve">Documento de Análisis del Sistema CultureGo (PMBOK, 7.ª edición).</w:t>
       </w:r>
+      <w:r>
+        <w:rPr>
+          <w:rtl w:val="0"/>
+        </w:rPr>
+      </w:r>
     </w:p>
     <w:p>
       <w:pPr>
@@ -2925,7 +2950,12 @@
           <w:vertAlign w:val="baseline"/>
           <w:rtl w:val="0"/>
         </w:rPr>
-        <w:t xml:space="preserve">Especificación de Casos de Uso CultureGo (CU-01 a CU-26) y sus diagramas de secuencia y de actividades.</w:t>
+        <w:t xml:space="preserve">Especificación de Casos de Uso CultureGo (CU-01 a CU-28) y sus diagramas de secuencia y de actividades.</w:t>
+      </w:r>
+      <w:r>
+        <w:rPr>
+          <w:rtl w:val="0"/>
+        </w:rPr>
       </w:r>
     </w:p>
     <w:p>
@@ -2970,6 +3000,11 @@
         </w:rPr>
         <w:t xml:space="preserve">Planilla de Requerimientos y Estructura de Desglose del Trabajo (EDT) del proyecto.</w:t>
       </w:r>
+      <w:r>
+        <w:rPr>
+          <w:rtl w:val="0"/>
+        </w:rPr>
+      </w:r>
     </w:p>
     <w:p>
       <w:pPr>
@@ -3012,6 +3047,11 @@
           <w:rtl w:val="0"/>
         </w:rPr>
         <w:t xml:space="preserve">Documentación oficial de Ionic, Angular, Capacitor, Leaflet, OpenStreetMap y Supabase.</w:t>
+      </w:r>
+      <w:r>
+        <w:rPr>
+          <w:rtl w:val="0"/>
+        </w:rPr>
       </w:r>
     </w:p>
     <w:p>
@@ -5749,15 +5789,7 @@
                 <w:szCs w:val="21"/>
                 <w:rtl w:val="0"/>
               </w:rPr>
-              <w:t xml:space="preserve">3.6.6 (x64)</w:t>
-            </w:r>
-            <w:r>
-              <w:rPr>
-                <w:sz w:val="21"/>
-                <w:szCs w:val="21"/>
-                <w:rtl w:val="0"/>
-              </w:rPr>
-              <w:t xml:space="preserve"> </w:t>
+              <w:t xml:space="preserve">3.6.6 (x64) </w:t>
             </w:r>
             <w:r>
               <w:rPr>
@@ -6272,7 +6304,7 @@
           <w:szCs w:val="22"/>
           <w:rtl w:val="0"/>
         </w:rPr>
-        <w:t xml:space="preserve">La base de datos es PostgreSQL con la extensión geoespacial PostGIS habilitada, provista por Supabase. El esquema se compone de las entidades definidas en el modelo de datos del proyecto: USUARIO, LUGAR, CATEGORIA, COMUNA, VISITA, MEDALLA, USUARIO_MEDALLA, AVATAR y REPORTE.</w:t>
+        <w:t xml:space="preserve">La base de datos es PostgreSQL con la extensión geoespacial PostGIS habilitada, provista por Supabase. El esquema se compone de las entidades definidas en el modelo de datos del proyecto: USUARIO, LUGAR, CATEGORIA, COMUNA, VISITA, MEDALLA, USUARIO_MEDALLA, AVATAR, REPORTE y LUGAR_SUGERIDO.</w:t>
       </w:r>
       <w:r>
         <w:rPr>
@@ -6542,7 +6574,7 @@
                 <w:szCs w:val="21"/>
                 <w:rtl w:val="0"/>
               </w:rPr>
-              <w:t xml:space="preserve">Resuelven consultas que las políticas RLS bloquean por tratarse de cruces entre usuarios, y la búsqueda geoespacial de lugares cercanos con PostGIS</w:t>
+              <w:t xml:space="preserve">Resuelven consultas que las políticas RLS bloquean por tratarse de cruces entre usuarios: búsqueda geoespacial de lugares cercanos con PostGIS (lugares_cercanos) y eliminación de la propia cuenta (fn_eliminar_mi_cuenta, RF-22)</w:t>
             </w:r>
             <w:r>
               <w:rPr>
@@ -6665,44 +6697,44 @@
                 <w:szCs w:val="21"/>
                 <w:rtl w:val="0"/>
               </w:rPr>
-              <w:t xml:space="preserve">Disparador fn_proteger_es_admin</w:t>
-            </w:r>
-            <w:r>
-              <w:rPr>
-                <w:rtl w:val="0"/>
-              </w:rPr>
-            </w:r>
-          </w:p>
-        </w:tc>
-        <w:tc>
-          <w:tcPr>
-            <w:tcBorders>
-              <w:top w:color="000000" w:space="0" w:sz="4" w:val="single"/>
-              <w:left w:color="000000" w:space="0" w:sz="4" w:val="single"/>
-              <w:bottom w:color="000000" w:space="0" w:sz="4" w:val="single"/>
-              <w:right w:color="000000" w:space="0" w:sz="4" w:val="single"/>
-            </w:tcBorders>
-            <w:tcMar>
-              <w:top w:w="50.0" w:type="dxa"/>
-              <w:left w:w="100.0" w:type="dxa"/>
-              <w:bottom w:w="50.0" w:type="dxa"/>
-              <w:right w:w="100.0" w:type="dxa"/>
-            </w:tcMar>
-            <w:vAlign w:val="top"/>
-          </w:tcPr>
-          <w:p>
-            <w:pPr>
-              <w:spacing w:after="20" w:lineRule="auto"/>
-              <w:rPr/>
-            </w:pPr>
-            <w:r>
-              <w:rPr>
-                <w:rFonts w:ascii="Arial" w:cs="Arial" w:eastAsia="Arial" w:hAnsi="Arial"/>
-                <w:sz w:val="21"/>
-                <w:szCs w:val="21"/>
-                <w:rtl w:val="0"/>
-              </w:rPr>
-              <w:t xml:space="preserve">Impide que una cuenta se asigne a sí misma el rol de administrador mediante llamadas directas a la API (RN-08)</w:t>
+              <w:t xml:space="preserve">Función fn_validar_cooldown_visita</w:t>
+            </w:r>
+            <w:r>
+              <w:rPr>
+                <w:rtl w:val="0"/>
+              </w:rPr>
+            </w:r>
+          </w:p>
+        </w:tc>
+        <w:tc>
+          <w:tcPr>
+            <w:tcBorders>
+              <w:top w:color="000000" w:space="0" w:sz="4" w:val="single"/>
+              <w:left w:color="000000" w:space="0" w:sz="4" w:val="single"/>
+              <w:bottom w:color="000000" w:space="0" w:sz="4" w:val="single"/>
+              <w:right w:color="000000" w:space="0" w:sz="4" w:val="single"/>
+            </w:tcBorders>
+            <w:tcMar>
+              <w:top w:w="50.0" w:type="dxa"/>
+              <w:left w:w="100.0" w:type="dxa"/>
+              <w:bottom w:w="50.0" w:type="dxa"/>
+              <w:right w:w="100.0" w:type="dxa"/>
+            </w:tcMar>
+            <w:vAlign w:val="top"/>
+          </w:tcPr>
+          <w:p>
+            <w:pPr>
+              <w:spacing w:after="20" w:lineRule="auto"/>
+              <w:rPr/>
+            </w:pPr>
+            <w:r>
+              <w:rPr>
+                <w:rFonts w:ascii="Arial" w:cs="Arial" w:eastAsia="Arial" w:hAnsi="Arial"/>
+                <w:sz w:val="21"/>
+                <w:szCs w:val="21"/>
+                <w:rtl w:val="0"/>
+              </w:rPr>
+              <w:t xml:space="preserve">Rechaza una segunda visita del mismo usuario al mismo lugar dentro de 6 horas (RF-14, RN-04)</w:t>
             </w:r>
             <w:r>
               <w:rPr>
@@ -6745,6 +6777,86 @@
                 <w:szCs w:val="21"/>
                 <w:rtl w:val="0"/>
               </w:rPr>
+              <w:t xml:space="preserve">Disparador fn_proteger_es_admin</w:t>
+            </w:r>
+            <w:r>
+              <w:rPr>
+                <w:rtl w:val="0"/>
+              </w:rPr>
+            </w:r>
+          </w:p>
+        </w:tc>
+        <w:tc>
+          <w:tcPr>
+            <w:tcBorders>
+              <w:top w:color="000000" w:space="0" w:sz="4" w:val="single"/>
+              <w:left w:color="000000" w:space="0" w:sz="4" w:val="single"/>
+              <w:bottom w:color="000000" w:space="0" w:sz="4" w:val="single"/>
+              <w:right w:color="000000" w:space="0" w:sz="4" w:val="single"/>
+            </w:tcBorders>
+            <w:tcMar>
+              <w:top w:w="50.0" w:type="dxa"/>
+              <w:left w:w="100.0" w:type="dxa"/>
+              <w:bottom w:w="50.0" w:type="dxa"/>
+              <w:right w:w="100.0" w:type="dxa"/>
+            </w:tcMar>
+            <w:vAlign w:val="top"/>
+          </w:tcPr>
+          <w:p>
+            <w:pPr>
+              <w:spacing w:after="20" w:lineRule="auto"/>
+              <w:rPr/>
+            </w:pPr>
+            <w:r>
+              <w:rPr>
+                <w:rFonts w:ascii="Arial" w:cs="Arial" w:eastAsia="Arial" w:hAnsi="Arial"/>
+                <w:sz w:val="21"/>
+                <w:szCs w:val="21"/>
+                <w:rtl w:val="0"/>
+              </w:rPr>
+              <w:t xml:space="preserve">Impide que una cuenta se asigne a sí misma el rol de administrador mediante llamadas directas a la API (RN-08)</w:t>
+            </w:r>
+            <w:r>
+              <w:rPr>
+                <w:rtl w:val="0"/>
+              </w:rPr>
+            </w:r>
+          </w:p>
+        </w:tc>
+      </w:tr>
+      <w:tr>
+        <w:trPr>
+          <w:cantSplit w:val="1"/>
+          <w:tblHeader w:val="0"/>
+        </w:trPr>
+        <w:tc>
+          <w:tcPr>
+            <w:tcBorders>
+              <w:top w:color="000000" w:space="0" w:sz="4" w:val="single"/>
+              <w:left w:color="000000" w:space="0" w:sz="4" w:val="single"/>
+              <w:bottom w:color="000000" w:space="0" w:sz="4" w:val="single"/>
+              <w:right w:color="000000" w:space="0" w:sz="4" w:val="single"/>
+            </w:tcBorders>
+            <w:tcMar>
+              <w:top w:w="50.0" w:type="dxa"/>
+              <w:left w:w="100.0" w:type="dxa"/>
+              <w:bottom w:w="50.0" w:type="dxa"/>
+              <w:right w:w="100.0" w:type="dxa"/>
+            </w:tcMar>
+            <w:vAlign w:val="top"/>
+          </w:tcPr>
+          <w:p>
+            <w:pPr>
+              <w:spacing w:after="20" w:lineRule="auto"/>
+              <w:rPr/>
+            </w:pPr>
+            <w:r>
+              <w:rPr>
+                <w:rFonts w:ascii="Arial" w:cs="Arial" w:eastAsia="Arial" w:hAnsi="Arial"/>
+                <w:sz w:val="21"/>
+                <w:szCs w:val="21"/>
+                <w:rtl w:val="0"/>
+              </w:rPr>
               <w:t xml:space="preserve">Migraciones numeradas</w:t>
             </w:r>
             <w:r>
@@ -6782,7 +6894,7 @@
                 <w:szCs w:val="21"/>
                 <w:rtl w:val="0"/>
               </w:rPr>
-              <w:t xml:space="preserve">Los cambios de esquema se aplican en orden secuencial desde el SQL Editor de Supabase; cada migración queda versionada en el repositorio</w:t>
+              <w:t xml:space="preserve">Los cambios de esquema se aplican en orden secuencial desde el SQL Editor de Supabase; cada migración debe quedar versionada en el repositorio, en una carpeta supabase/migrations</w:t>
             </w:r>
             <w:r>
               <w:rPr>
@@ -7282,44 +7394,44 @@
                 <w:szCs w:val="21"/>
                 <w:rtl w:val="0"/>
               </w:rPr>
-              <w:t xml:space="preserve">C-08</w:t>
-            </w:r>
-            <w:r>
-              <w:rPr>
-                <w:rtl w:val="0"/>
-              </w:rPr>
-            </w:r>
-          </w:p>
-        </w:tc>
-        <w:tc>
-          <w:tcPr>
-            <w:tcBorders>
-              <w:top w:color="000000" w:space="0" w:sz="4" w:val="single"/>
-              <w:left w:color="000000" w:space="0" w:sz="4" w:val="single"/>
-              <w:bottom w:color="000000" w:space="0" w:sz="4" w:val="single"/>
-              <w:right w:color="000000" w:space="0" w:sz="4" w:val="single"/>
-            </w:tcBorders>
-            <w:tcMar>
-              <w:top w:w="50.0" w:type="dxa"/>
-              <w:left w:w="100.0" w:type="dxa"/>
-              <w:bottom w:w="50.0" w:type="dxa"/>
-              <w:right w:w="100.0" w:type="dxa"/>
-            </w:tcMar>
-            <w:vAlign w:val="top"/>
-          </w:tcPr>
-          <w:p>
-            <w:pPr>
-              <w:spacing w:after="20" w:lineRule="auto"/>
-              <w:rPr/>
-            </w:pPr>
-            <w:r>
-              <w:rPr>
-                <w:rFonts w:ascii="Arial" w:cs="Arial" w:eastAsia="Arial" w:hAnsi="Arial"/>
-                <w:sz w:val="21"/>
-                <w:szCs w:val="21"/>
-                <w:rtl w:val="0"/>
-              </w:rPr>
-              <w:t xml:space="preserve">El uso del servidor público de teselas de OpenStreetMap debe ajustarse a su política de uso aceptable, evitando solicitudes innecesarias (RNF-14).</w:t>
+              <w:t xml:space="preserve">—</w:t>
+            </w:r>
+            <w:r>
+              <w:rPr>
+                <w:rtl w:val="0"/>
+              </w:rPr>
+            </w:r>
+          </w:p>
+        </w:tc>
+        <w:tc>
+          <w:tcPr>
+            <w:tcBorders>
+              <w:top w:color="000000" w:space="0" w:sz="4" w:val="single"/>
+              <w:left w:color="000000" w:space="0" w:sz="4" w:val="single"/>
+              <w:bottom w:color="000000" w:space="0" w:sz="4" w:val="single"/>
+              <w:right w:color="000000" w:space="0" w:sz="4" w:val="single"/>
+            </w:tcBorders>
+            <w:tcMar>
+              <w:top w:w="50.0" w:type="dxa"/>
+              <w:left w:w="100.0" w:type="dxa"/>
+              <w:bottom w:w="50.0" w:type="dxa"/>
+              <w:right w:w="100.0" w:type="dxa"/>
+            </w:tcMar>
+            <w:vAlign w:val="top"/>
+          </w:tcPr>
+          <w:p>
+            <w:pPr>
+              <w:spacing w:after="20" w:lineRule="auto"/>
+              <w:rPr/>
+            </w:pPr>
+            <w:r>
+              <w:rPr>
+                <w:rFonts w:ascii="Arial" w:cs="Arial" w:eastAsia="Arial" w:hAnsi="Arial"/>
+                <w:sz w:val="21"/>
+                <w:szCs w:val="21"/>
+                <w:rtl w:val="0"/>
+              </w:rPr>
+              <w:t xml:space="preserve">El uso del servidor público de teselas de OpenStreetMap debe ajustarse a su política de uso aceptable, evitando solicitudes innecesarias.</w:t>
             </w:r>
             <w:r>
               <w:rPr>
@@ -7875,7 +7987,7 @@
                 <w:szCs w:val="21"/>
                 <w:rtl w:val="0"/>
               </w:rPr>
-              <w:t xml:space="preserve">Estructura modular, inyección de dependencias y separación entre lógica y vista, lo que facilita RNF-10 y RNF-11</w:t>
+              <w:t xml:space="preserve">Estructura modular, inyección de dependencias y separación entre lógica y vista, lo que facilita RNF-10</w:t>
             </w:r>
             <w:r>
               <w:rPr>
@@ -8181,7 +8293,7 @@
                 <w:szCs w:val="21"/>
                 <w:rtl w:val="0"/>
               </w:rPr>
-              <w:t xml:space="preserve">Permite generar la app para Android e iOS y acceder a la geolocalización sin escribir código nativo</w:t>
+              <w:t xml:space="preserve">Permite generar la app para Android e iOS y acceder a la geolocalización (plugin @capacitor/geolocation 8.2.2) sin escribir código nativo</w:t>
             </w:r>
             <w:r>
               <w:rPr>
@@ -9966,7 +10078,7 @@
           <w:szCs w:val="22"/>
           <w:rtl w:val="0"/>
         </w:rPr>
-        <w:t xml:space="preserve">Ionic con Capacitor permite cubrir Android e iOS con una sola base de código, requisito indispensable para un equipo de tres personas, y mantiene abierta la portabilidad hacia una versión web (RNF-11).</w:t>
+        <w:t xml:space="preserve">Ionic con Capacitor permite cubrir Android e iOS con una sola base de código, requisito indispensable para un equipo de tres personas.</w:t>
       </w:r>
       <w:r>
         <w:rPr>
@@ -10054,7 +10166,7 @@
           <w:szCs w:val="22"/>
           <w:rtl w:val="0"/>
         </w:rPr>
-        <w:t xml:space="preserve">El otorgamiento de medallas y la protección del rol de administrador se implementan como disparadores y políticas, de modo que la regla se cumple aunque se llame directamente a la API y no solo desde la interfaz (RN-07, RN-08).</w:t>
+        <w:t xml:space="preserve">El otorgamiento de medallas, el período de 6 horas entre visitas y la protección del rol de administrador se implementan como disparadores, funciones y políticas, de modo que la regla se cumple aunque se llame directamente a la API y no solo desde la interfaz (RN-07, RN-08).</w:t>
       </w:r>
       <w:r>
         <w:rPr>
@@ -10134,7 +10246,7 @@
           <w:szCs w:val="22"/>
           <w:rtl w:val="0"/>
         </w:rPr>
-        <w:t xml:space="preserve">El código fuente se organiza en tres bloques dentro de src/app: core contiene lo transversal (modelos, servicios y guards), features agrupa los módulos funcionales de la aplicación y shared reúne los componentes reutilizables. Esta separación es la que sostiene el cumplimiento de RNF-10 y RNF-11.</w:t>
+        <w:t xml:space="preserve">El código fuente se organiza en tres bloques dentro de src/app: core contiene lo transversal (modelos, servicios y guards), features agrupa los módulos funcionales de la aplicación y shared reúne los componentes reutilizables. Esta separación es la que sostiene el cumplimiento de RNF-10.</w:t>
       </w:r>
       <w:r>
         <w:rPr>
@@ -10259,7 +10371,7 @@
                 <w:szCs w:val="18"/>
                 <w:rtl w:val="0"/>
               </w:rPr>
-              <w:t xml:space="preserve">│   │   ├── models/          Un archivo .ts por entidad del modelo de datos + index.ts</w:t>
+              <w:t xml:space="preserve">│   │   ├── models/       Un .ts por entidad del modelo + index.ts</w:t>
             </w:r>
             <w:r>
               <w:rPr>
@@ -10279,7 +10391,7 @@
                 <w:szCs w:val="18"/>
                 <w:rtl w:val="0"/>
               </w:rPr>
-              <w:t xml:space="preserve">│   │   ├── services/        Supabase, Auth, Lugares, Comunas, Categorias,</w:t>
+              <w:t xml:space="preserve">│   │   ├── services/     Supabase, Auth, Lugares, Comunas, Categorias,</w:t>
             </w:r>
             <w:r>
               <w:rPr>
@@ -10299,7 +10411,7 @@
                 <w:szCs w:val="18"/>
                 <w:rtl w:val="0"/>
               </w:rPr>
-              <w:t xml:space="preserve">│   │   │                    Gamificacion, Admin</w:t>
+              <w:t xml:space="preserve">│   │   │                 Gamificacion, Avatar, Reportes,</w:t>
             </w:r>
             <w:r>
               <w:rPr>
@@ -10319,7 +10431,7 @@
                 <w:szCs w:val="18"/>
                 <w:rtl w:val="0"/>
               </w:rPr>
-              <w:t xml:space="preserve">│   │   └── guards/          auth-guard.ts (authGuard), admin-guard.ts (adminGuard)</w:t>
+              <w:t xml:space="preserve">│   │   │                 SugerenciasLugar, Admin, Theme</w:t>
             </w:r>
             <w:r>
               <w:rPr>
@@ -10339,7 +10451,7 @@
                 <w:szCs w:val="18"/>
                 <w:rtl w:val="0"/>
               </w:rPr>
-              <w:t xml:space="preserve">│   ├── features/</w:t>
+              <w:t xml:space="preserve">│   │   ├── guards/       authGuard, adminGuard</w:t>
             </w:r>
             <w:r>
               <w:rPr>
@@ -10359,7 +10471,7 @@
                 <w:szCs w:val="18"/>
                 <w:rtl w:val="0"/>
               </w:rPr>
-              <w:t xml:space="preserve">│   │   ├── auth/            login/, registro/</w:t>
+              <w:t xml:space="preserve">│   │   └── utils/        tema-categoria, traducir-error-auth,</w:t>
             </w:r>
             <w:r>
               <w:rPr>
@@ -10379,7 +10491,7 @@
                 <w:szCs w:val="18"/>
                 <w:rtl w:val="0"/>
               </w:rPr>
-              <w:t xml:space="preserve">│   │   ├── inicio/          pagina-inicio/</w:t>
+              <w:t xml:space="preserve">│   │                     comprimir-imagen</w:t>
             </w:r>
             <w:r>
               <w:rPr>
@@ -10399,7 +10511,7 @@
                 <w:szCs w:val="18"/>
                 <w:rtl w:val="0"/>
               </w:rPr>
-              <w:t xml:space="preserve">│   │   ├── catalogo/        lista-lugares/, detalle-lugar/</w:t>
+              <w:t xml:space="preserve">│   ├── features/</w:t>
             </w:r>
             <w:r>
               <w:rPr>
@@ -10419,7 +10531,7 @@
                 <w:szCs w:val="18"/>
                 <w:rtl w:val="0"/>
               </w:rPr>
-              <w:t xml:space="preserve">│   │   ├── mapa/            pagina-mapa/</w:t>
+              <w:t xml:space="preserve">│   │   ├── auth/         login/, registro/, recuperar-password/,</w:t>
             </w:r>
             <w:r>
               <w:rPr>
@@ -10439,7 +10551,7 @@
                 <w:szCs w:val="18"/>
                 <w:rtl w:val="0"/>
               </w:rPr>
-              <w:t xml:space="preserve">│   │   ├── perfil/          pagina-perfil/</w:t>
+              <w:t xml:space="preserve">│   │   │                 restablecer-password/</w:t>
             </w:r>
             <w:r>
               <w:rPr>
@@ -10459,7 +10571,7 @@
                 <w:szCs w:val="18"/>
                 <w:rtl w:val="0"/>
               </w:rPr>
-              <w:t xml:space="preserve">│   │   ├── gamificacion/    medallas/</w:t>
+              <w:t xml:space="preserve">│   │   ├── inicio/       pagina-inicio/</w:t>
             </w:r>
             <w:r>
               <w:rPr>
@@ -10479,7 +10591,7 @@
                 <w:szCs w:val="18"/>
                 <w:rtl w:val="0"/>
               </w:rPr>
-              <w:t xml:space="preserve">│   │   └── admin/           login-admin/, gestion-lugares/</w:t>
+              <w:t xml:space="preserve">│   │   ├── catalogo/     lista-lugares/, detalle-lugar/</w:t>
             </w:r>
             <w:r>
               <w:rPr>
@@ -10499,7 +10611,7 @@
                 <w:szCs w:val="18"/>
                 <w:rtl w:val="0"/>
               </w:rPr>
-              <w:t xml:space="preserve">│   ├── shared/</w:t>
+              <w:t xml:space="preserve">│   │   ├── mapa/         pagina-mapa/</w:t>
             </w:r>
             <w:r>
               <w:rPr>
@@ -10519,7 +10631,7 @@
                 <w:szCs w:val="18"/>
                 <w:rtl w:val="0"/>
               </w:rPr>
-              <w:t xml:space="preserve">│   │   └── components/      tabs/ (shell de navegación)</w:t>
+              <w:t xml:space="preserve">│   │   ├── perfil/       pagina-perfil/, configuracion/,</w:t>
             </w:r>
             <w:r>
               <w:rPr>
@@ -10539,7 +10651,7 @@
                 <w:szCs w:val="18"/>
                 <w:rtl w:val="0"/>
               </w:rPr>
-              <w:t xml:space="preserve">│   └── app.routes.ts        Definición de rutas y guards</w:t>
+              <w:t xml:space="preserve">│   │   │                 mis-tickets/, personalizar-avatar/</w:t>
             </w:r>
             <w:r>
               <w:rPr>
@@ -10559,7 +10671,7 @@
                 <w:szCs w:val="18"/>
                 <w:rtl w:val="0"/>
               </w:rPr>
-              <w:t xml:space="preserve">├── environments/            environment.ts y environment.prod.ts (no versionados)</w:t>
+              <w:t xml:space="preserve">│   │   ├── gamificacion/ medallas/</w:t>
             </w:r>
             <w:r>
               <w:rPr>
@@ -10579,7 +10691,7 @@
                 <w:szCs w:val="18"/>
                 <w:rtl w:val="0"/>
               </w:rPr>
-              <w:t xml:space="preserve">├── theme/                   variables.scss (paleta y tipografías)</w:t>
+              <w:t xml:space="preserve">│   │   └── admin/        gestion-lugares/</w:t>
             </w:r>
             <w:r>
               <w:rPr>
@@ -10599,7 +10711,127 @@
                 <w:szCs w:val="18"/>
                 <w:rtl w:val="0"/>
               </w:rPr>
-              <w:t xml:space="preserve">└── main.ts                  Arranque de la aplicación y providers</w:t>
+              <w:t xml:space="preserve">│   ├── shared/</w:t>
+            </w:r>
+            <w:r>
+              <w:rPr>
+                <w:rtl w:val="0"/>
+              </w:rPr>
+            </w:r>
+          </w:p>
+          <w:p>
+            <w:pPr>
+              <w:spacing w:after="0" w:line="240" w:lineRule="auto"/>
+              <w:rPr/>
+            </w:pPr>
+            <w:r>
+              <w:rPr>
+                <w:rFonts w:ascii="Consolas" w:cs="Consolas" w:eastAsia="Consolas" w:hAnsi="Consolas"/>
+                <w:sz w:val="18"/>
+                <w:szCs w:val="18"/>
+                <w:rtl w:val="0"/>
+              </w:rPr>
+              <w:t xml:space="preserve">│   │   └── components/   tabs/, avatar-preview/, reportar-problema/,</w:t>
+            </w:r>
+            <w:r>
+              <w:rPr>
+                <w:rtl w:val="0"/>
+              </w:rPr>
+            </w:r>
+          </w:p>
+          <w:p>
+            <w:pPr>
+              <w:spacing w:after="0" w:line="240" w:lineRule="auto"/>
+              <w:rPr/>
+            </w:pPr>
+            <w:r>
+              <w:rPr>
+                <w:rFonts w:ascii="Consolas" w:cs="Consolas" w:eastAsia="Consolas" w:hAnsi="Consolas"/>
+                <w:sz w:val="18"/>
+                <w:szCs w:val="18"/>
+                <w:rtl w:val="0"/>
+              </w:rPr>
+              <w:t xml:space="preserve">│   │                     sugerir-lugar/, terminos-condiciones/</w:t>
+            </w:r>
+            <w:r>
+              <w:rPr>
+                <w:rtl w:val="0"/>
+              </w:rPr>
+            </w:r>
+          </w:p>
+          <w:p>
+            <w:pPr>
+              <w:spacing w:after="0" w:line="240" w:lineRule="auto"/>
+              <w:rPr/>
+            </w:pPr>
+            <w:r>
+              <w:rPr>
+                <w:rFonts w:ascii="Consolas" w:cs="Consolas" w:eastAsia="Consolas" w:hAnsi="Consolas"/>
+                <w:sz w:val="18"/>
+                <w:szCs w:val="18"/>
+                <w:rtl w:val="0"/>
+              </w:rPr>
+              <w:t xml:space="preserve">│   └── app.routes.ts     Rutas y guards</w:t>
+            </w:r>
+            <w:r>
+              <w:rPr>
+                <w:rtl w:val="0"/>
+              </w:rPr>
+            </w:r>
+          </w:p>
+          <w:p>
+            <w:pPr>
+              <w:spacing w:after="0" w:line="240" w:lineRule="auto"/>
+              <w:rPr/>
+            </w:pPr>
+            <w:r>
+              <w:rPr>
+                <w:rFonts w:ascii="Consolas" w:cs="Consolas" w:eastAsia="Consolas" w:hAnsi="Consolas"/>
+                <w:sz w:val="18"/>
+                <w:szCs w:val="18"/>
+                <w:rtl w:val="0"/>
+              </w:rPr>
+              <w:t xml:space="preserve">├── environments/         environment.ts y .prod.ts (no versionados)</w:t>
+            </w:r>
+            <w:r>
+              <w:rPr>
+                <w:rtl w:val="0"/>
+              </w:rPr>
+            </w:r>
+          </w:p>
+          <w:p>
+            <w:pPr>
+              <w:spacing w:after="0" w:line="240" w:lineRule="auto"/>
+              <w:rPr/>
+            </w:pPr>
+            <w:r>
+              <w:rPr>
+                <w:rFonts w:ascii="Consolas" w:cs="Consolas" w:eastAsia="Consolas" w:hAnsi="Consolas"/>
+                <w:sz w:val="18"/>
+                <w:szCs w:val="18"/>
+                <w:rtl w:val="0"/>
+              </w:rPr>
+              <w:t xml:space="preserve">├── theme/                variables.scss (paleta, fuentes, modo oscuro)</w:t>
+            </w:r>
+            <w:r>
+              <w:rPr>
+                <w:rtl w:val="0"/>
+              </w:rPr>
+            </w:r>
+          </w:p>
+          <w:p>
+            <w:pPr>
+              <w:spacing w:after="0" w:line="240" w:lineRule="auto"/>
+              <w:rPr/>
+            </w:pPr>
+            <w:r>
+              <w:rPr>
+                <w:rFonts w:ascii="Consolas" w:cs="Consolas" w:eastAsia="Consolas" w:hAnsi="Consolas"/>
+                <w:sz w:val="18"/>
+                <w:szCs w:val="18"/>
+                <w:rtl w:val="0"/>
+              </w:rPr>
+              <w:t xml:space="preserve">└── main.ts               Arranque de la aplicación y providers</w:t>
             </w:r>
             <w:r>
               <w:rPr>
@@ -10803,7 +11035,7 @@
                 <w:szCs w:val="21"/>
                 <w:rtl w:val="0"/>
               </w:rPr>
-              <w:t xml:space="preserve">Interfaces TypeScript que reflejan las entidades del modelo de datos. Un archivo por entidad, con un index.ts que reexporta todo.</w:t>
+              <w:t xml:space="preserve">Interfaces TypeScript que reflejan las entidades del modelo de datos. Un archivo por entidad, con el sufijo .model.ts y un index.ts que reexporta todo.</w:t>
             </w:r>
             <w:r>
               <w:rPr>
@@ -11006,44 +11238,44 @@
                 <w:szCs w:val="21"/>
                 <w:rtl w:val="0"/>
               </w:rPr>
-              <w:t xml:space="preserve">features</w:t>
-            </w:r>
-            <w:r>
-              <w:rPr>
-                <w:rtl w:val="0"/>
-              </w:rPr>
-            </w:r>
-          </w:p>
-        </w:tc>
-        <w:tc>
-          <w:tcPr>
-            <w:tcBorders>
-              <w:top w:color="000000" w:space="0" w:sz="4" w:val="single"/>
-              <w:left w:color="000000" w:space="0" w:sz="4" w:val="single"/>
-              <w:bottom w:color="000000" w:space="0" w:sz="4" w:val="single"/>
-              <w:right w:color="000000" w:space="0" w:sz="4" w:val="single"/>
-            </w:tcBorders>
-            <w:tcMar>
-              <w:top w:w="50.0" w:type="dxa"/>
-              <w:left w:w="100.0" w:type="dxa"/>
-              <w:bottom w:w="50.0" w:type="dxa"/>
-              <w:right w:w="100.0" w:type="dxa"/>
-            </w:tcMar>
-            <w:vAlign w:val="top"/>
-          </w:tcPr>
-          <w:p>
-            <w:pPr>
-              <w:spacing w:after="20" w:lineRule="auto"/>
-              <w:rPr/>
-            </w:pPr>
-            <w:r>
-              <w:rPr>
-                <w:rFonts w:ascii="Arial" w:cs="Arial" w:eastAsia="Arial" w:hAnsi="Arial"/>
-                <w:sz w:val="21"/>
-                <w:szCs w:val="21"/>
-                <w:rtl w:val="0"/>
-              </w:rPr>
-              <w:t xml:space="preserve">Un subdirectorio por módulo funcional, y dentro de él un subdirectorio por pantalla. Cada pantalla es un componente standalone con sus archivos .ts, .html, .scss y .spec.ts.</w:t>
+              <w:t xml:space="preserve">core/utils</w:t>
+            </w:r>
+            <w:r>
+              <w:rPr>
+                <w:rtl w:val="0"/>
+              </w:rPr>
+            </w:r>
+          </w:p>
+        </w:tc>
+        <w:tc>
+          <w:tcPr>
+            <w:tcBorders>
+              <w:top w:color="000000" w:space="0" w:sz="4" w:val="single"/>
+              <w:left w:color="000000" w:space="0" w:sz="4" w:val="single"/>
+              <w:bottom w:color="000000" w:space="0" w:sz="4" w:val="single"/>
+              <w:right w:color="000000" w:space="0" w:sz="4" w:val="single"/>
+            </w:tcBorders>
+            <w:tcMar>
+              <w:top w:w="50.0" w:type="dxa"/>
+              <w:left w:w="100.0" w:type="dxa"/>
+              <w:bottom w:w="50.0" w:type="dxa"/>
+              <w:right w:w="100.0" w:type="dxa"/>
+            </w:tcMar>
+            <w:vAlign w:val="top"/>
+          </w:tcPr>
+          <w:p>
+            <w:pPr>
+              <w:spacing w:after="20" w:lineRule="auto"/>
+              <w:rPr/>
+            </w:pPr>
+            <w:r>
+              <w:rPr>
+                <w:rFonts w:ascii="Arial" w:cs="Arial" w:eastAsia="Arial" w:hAnsi="Arial"/>
+                <w:sz w:val="21"/>
+                <w:szCs w:val="21"/>
+                <w:rtl w:val="0"/>
+              </w:rPr>
+              <w:t xml:space="preserve">Funciones puras sin estado reutilizadas por varios módulos: colores e íconos por categoría, traducción de errores de autenticación y compresión de imágenes antes de subirlas.</w:t>
             </w:r>
             <w:r>
               <w:rPr>
@@ -11086,44 +11318,44 @@
                 <w:szCs w:val="21"/>
                 <w:rtl w:val="0"/>
               </w:rPr>
-              <w:t xml:space="preserve">shared/components</w:t>
-            </w:r>
-            <w:r>
-              <w:rPr>
-                <w:rtl w:val="0"/>
-              </w:rPr>
-            </w:r>
-          </w:p>
-        </w:tc>
-        <w:tc>
-          <w:tcPr>
-            <w:tcBorders>
-              <w:top w:color="000000" w:space="0" w:sz="4" w:val="single"/>
-              <w:left w:color="000000" w:space="0" w:sz="4" w:val="single"/>
-              <w:bottom w:color="000000" w:space="0" w:sz="4" w:val="single"/>
-              <w:right w:color="000000" w:space="0" w:sz="4" w:val="single"/>
-            </w:tcBorders>
-            <w:tcMar>
-              <w:top w:w="50.0" w:type="dxa"/>
-              <w:left w:w="100.0" w:type="dxa"/>
-              <w:bottom w:w="50.0" w:type="dxa"/>
-              <w:right w:w="100.0" w:type="dxa"/>
-            </w:tcMar>
-            <w:vAlign w:val="top"/>
-          </w:tcPr>
-          <w:p>
-            <w:pPr>
-              <w:spacing w:after="20" w:lineRule="auto"/>
-              <w:rPr/>
-            </w:pPr>
-            <w:r>
-              <w:rPr>
-                <w:rFonts w:ascii="Arial" w:cs="Arial" w:eastAsia="Arial" w:hAnsi="Arial"/>
-                <w:sz w:val="21"/>
-                <w:szCs w:val="21"/>
-                <w:rtl w:val="0"/>
-              </w:rPr>
-              <w:t xml:space="preserve">Componentes reutilizados por más de un módulo, como el shell de pestañas.</w:t>
+              <w:t xml:space="preserve">features</w:t>
+            </w:r>
+            <w:r>
+              <w:rPr>
+                <w:rtl w:val="0"/>
+              </w:rPr>
+            </w:r>
+          </w:p>
+        </w:tc>
+        <w:tc>
+          <w:tcPr>
+            <w:tcBorders>
+              <w:top w:color="000000" w:space="0" w:sz="4" w:val="single"/>
+              <w:left w:color="000000" w:space="0" w:sz="4" w:val="single"/>
+              <w:bottom w:color="000000" w:space="0" w:sz="4" w:val="single"/>
+              <w:right w:color="000000" w:space="0" w:sz="4" w:val="single"/>
+            </w:tcBorders>
+            <w:tcMar>
+              <w:top w:w="50.0" w:type="dxa"/>
+              <w:left w:w="100.0" w:type="dxa"/>
+              <w:bottom w:w="50.0" w:type="dxa"/>
+              <w:right w:w="100.0" w:type="dxa"/>
+            </w:tcMar>
+            <w:vAlign w:val="top"/>
+          </w:tcPr>
+          <w:p>
+            <w:pPr>
+              <w:spacing w:after="20" w:lineRule="auto"/>
+              <w:rPr/>
+            </w:pPr>
+            <w:r>
+              <w:rPr>
+                <w:rFonts w:ascii="Arial" w:cs="Arial" w:eastAsia="Arial" w:hAnsi="Arial"/>
+                <w:sz w:val="21"/>
+                <w:szCs w:val="21"/>
+                <w:rtl w:val="0"/>
+              </w:rPr>
+              <w:t xml:space="preserve">Un subdirectorio por módulo funcional, y dentro de él un subdirectorio por pantalla. Cada pantalla es un componente standalone con sus archivos .ts, .html, .scss y .spec.ts.</w:t>
             </w:r>
             <w:r>
               <w:rPr>
@@ -11166,6 +11398,86 @@
                 <w:szCs w:val="21"/>
                 <w:rtl w:val="0"/>
               </w:rPr>
+              <w:t xml:space="preserve">shared/components</w:t>
+            </w:r>
+            <w:r>
+              <w:rPr>
+                <w:rtl w:val="0"/>
+              </w:rPr>
+            </w:r>
+          </w:p>
+        </w:tc>
+        <w:tc>
+          <w:tcPr>
+            <w:tcBorders>
+              <w:top w:color="000000" w:space="0" w:sz="4" w:val="single"/>
+              <w:left w:color="000000" w:space="0" w:sz="4" w:val="single"/>
+              <w:bottom w:color="000000" w:space="0" w:sz="4" w:val="single"/>
+              <w:right w:color="000000" w:space="0" w:sz="4" w:val="single"/>
+            </w:tcBorders>
+            <w:tcMar>
+              <w:top w:w="50.0" w:type="dxa"/>
+              <w:left w:w="100.0" w:type="dxa"/>
+              <w:bottom w:w="50.0" w:type="dxa"/>
+              <w:right w:w="100.0" w:type="dxa"/>
+            </w:tcMar>
+            <w:vAlign w:val="top"/>
+          </w:tcPr>
+          <w:p>
+            <w:pPr>
+              <w:spacing w:after="20" w:lineRule="auto"/>
+              <w:rPr/>
+            </w:pPr>
+            <w:r>
+              <w:rPr>
+                <w:rFonts w:ascii="Arial" w:cs="Arial" w:eastAsia="Arial" w:hAnsi="Arial"/>
+                <w:sz w:val="21"/>
+                <w:szCs w:val="21"/>
+                <w:rtl w:val="0"/>
+              </w:rPr>
+              <w:t xml:space="preserve">Componentes reutilizados por más de un módulo: el shell de pestañas, la vista previa del avatar, los formularios modales de reporte y sugerencia, y los Términos y Condiciones.</w:t>
+            </w:r>
+            <w:r>
+              <w:rPr>
+                <w:rtl w:val="0"/>
+              </w:rPr>
+            </w:r>
+          </w:p>
+        </w:tc>
+      </w:tr>
+      <w:tr>
+        <w:trPr>
+          <w:cantSplit w:val="1"/>
+          <w:tblHeader w:val="0"/>
+        </w:trPr>
+        <w:tc>
+          <w:tcPr>
+            <w:tcBorders>
+              <w:top w:color="000000" w:space="0" w:sz="4" w:val="single"/>
+              <w:left w:color="000000" w:space="0" w:sz="4" w:val="single"/>
+              <w:bottom w:color="000000" w:space="0" w:sz="4" w:val="single"/>
+              <w:right w:color="000000" w:space="0" w:sz="4" w:val="single"/>
+            </w:tcBorders>
+            <w:tcMar>
+              <w:top w:w="50.0" w:type="dxa"/>
+              <w:left w:w="100.0" w:type="dxa"/>
+              <w:bottom w:w="50.0" w:type="dxa"/>
+              <w:right w:w="100.0" w:type="dxa"/>
+            </w:tcMar>
+            <w:vAlign w:val="top"/>
+          </w:tcPr>
+          <w:p>
+            <w:pPr>
+              <w:spacing w:after="20" w:lineRule="auto"/>
+              <w:rPr/>
+            </w:pPr>
+            <w:r>
+              <w:rPr>
+                <w:rFonts w:ascii="Arial" w:cs="Arial" w:eastAsia="Arial" w:hAnsi="Arial"/>
+                <w:sz w:val="21"/>
+                <w:szCs w:val="21"/>
+                <w:rtl w:val="0"/>
+              </w:rPr>
               <w:t xml:space="preserve">theme</w:t>
             </w:r>
             <w:r>
@@ -11203,7 +11515,7 @@
                 <w:szCs w:val="21"/>
                 <w:rtl w:val="0"/>
               </w:rPr>
-              <w:t xml:space="preserve">Variables de color y tipografía que definen la identidad visual de la aplicación.</w:t>
+              <w:t xml:space="preserve">Variables de color y tipografía que definen la identidad visual de la aplicación, en modo claro y oscuro.</w:t>
             </w:r>
             <w:r>
               <w:rPr>
@@ -12147,81 +12459,81 @@
                 <w:szCs w:val="21"/>
                 <w:rtl w:val="0"/>
               </w:rPr>
-              <w:t xml:space="preserve">/login y /registro</w:t>
-            </w:r>
-            <w:r>
-              <w:rPr>
-                <w:rtl w:val="0"/>
-              </w:rPr>
-            </w:r>
-          </w:p>
-        </w:tc>
-        <w:tc>
-          <w:tcPr>
-            <w:tcBorders>
-              <w:top w:color="000000" w:space="0" w:sz="4" w:val="single"/>
-              <w:left w:color="000000" w:space="0" w:sz="4" w:val="single"/>
-              <w:bottom w:color="000000" w:space="0" w:sz="4" w:val="single"/>
-              <w:right w:color="000000" w:space="0" w:sz="4" w:val="single"/>
-            </w:tcBorders>
-            <w:tcMar>
-              <w:top w:w="50.0" w:type="dxa"/>
-              <w:left w:w="100.0" w:type="dxa"/>
-              <w:bottom w:w="50.0" w:type="dxa"/>
-              <w:right w:w="100.0" w:type="dxa"/>
-            </w:tcMar>
-            <w:vAlign w:val="top"/>
-          </w:tcPr>
-          <w:p>
-            <w:pPr>
-              <w:spacing w:after="20" w:lineRule="auto"/>
-              <w:rPr/>
-            </w:pPr>
-            <w:r>
-              <w:rPr>
-                <w:rFonts w:ascii="Arial" w:cs="Arial" w:eastAsia="Arial" w:hAnsi="Arial"/>
-                <w:sz w:val="21"/>
-                <w:szCs w:val="21"/>
-                <w:rtl w:val="0"/>
-              </w:rPr>
-              <w:t xml:space="preserve">login, registro</w:t>
-            </w:r>
-            <w:r>
-              <w:rPr>
-                <w:rtl w:val="0"/>
-              </w:rPr>
-            </w:r>
-          </w:p>
-        </w:tc>
-        <w:tc>
-          <w:tcPr>
-            <w:tcBorders>
-              <w:top w:color="000000" w:space="0" w:sz="4" w:val="single"/>
-              <w:left w:color="000000" w:space="0" w:sz="4" w:val="single"/>
-              <w:bottom w:color="000000" w:space="0" w:sz="4" w:val="single"/>
-              <w:right w:color="000000" w:space="0" w:sz="4" w:val="single"/>
-            </w:tcBorders>
-            <w:tcMar>
-              <w:top w:w="50.0" w:type="dxa"/>
-              <w:left w:w="100.0" w:type="dxa"/>
-              <w:bottom w:w="50.0" w:type="dxa"/>
-              <w:right w:w="100.0" w:type="dxa"/>
-            </w:tcMar>
-            <w:vAlign w:val="top"/>
-          </w:tcPr>
-          <w:p>
-            <w:pPr>
-              <w:spacing w:after="20" w:lineRule="auto"/>
-              <w:rPr/>
-            </w:pPr>
-            <w:r>
-              <w:rPr>
-                <w:rFonts w:ascii="Arial" w:cs="Arial" w:eastAsia="Arial" w:hAnsi="Arial"/>
-                <w:sz w:val="21"/>
-                <w:szCs w:val="21"/>
-                <w:rtl w:val="0"/>
-              </w:rPr>
-              <w:t xml:space="preserve">Sin guard</w:t>
+              <w:t xml:space="preserve">/perfil/personalizar-avatar</w:t>
+            </w:r>
+            <w:r>
+              <w:rPr>
+                <w:rtl w:val="0"/>
+              </w:rPr>
+            </w:r>
+          </w:p>
+        </w:tc>
+        <w:tc>
+          <w:tcPr>
+            <w:tcBorders>
+              <w:top w:color="000000" w:space="0" w:sz="4" w:val="single"/>
+              <w:left w:color="000000" w:space="0" w:sz="4" w:val="single"/>
+              <w:bottom w:color="000000" w:space="0" w:sz="4" w:val="single"/>
+              <w:right w:color="000000" w:space="0" w:sz="4" w:val="single"/>
+            </w:tcBorders>
+            <w:tcMar>
+              <w:top w:w="50.0" w:type="dxa"/>
+              <w:left w:w="100.0" w:type="dxa"/>
+              <w:bottom w:w="50.0" w:type="dxa"/>
+              <w:right w:w="100.0" w:type="dxa"/>
+            </w:tcMar>
+            <w:vAlign w:val="top"/>
+          </w:tcPr>
+          <w:p>
+            <w:pPr>
+              <w:spacing w:after="20" w:lineRule="auto"/>
+              <w:rPr/>
+            </w:pPr>
+            <w:r>
+              <w:rPr>
+                <w:rFonts w:ascii="Arial" w:cs="Arial" w:eastAsia="Arial" w:hAnsi="Arial"/>
+                <w:sz w:val="21"/>
+                <w:szCs w:val="21"/>
+                <w:rtl w:val="0"/>
+              </w:rPr>
+              <w:t xml:space="preserve">personalizar-avatar</w:t>
+            </w:r>
+            <w:r>
+              <w:rPr>
+                <w:rtl w:val="0"/>
+              </w:rPr>
+            </w:r>
+          </w:p>
+        </w:tc>
+        <w:tc>
+          <w:tcPr>
+            <w:tcBorders>
+              <w:top w:color="000000" w:space="0" w:sz="4" w:val="single"/>
+              <w:left w:color="000000" w:space="0" w:sz="4" w:val="single"/>
+              <w:bottom w:color="000000" w:space="0" w:sz="4" w:val="single"/>
+              <w:right w:color="000000" w:space="0" w:sz="4" w:val="single"/>
+            </w:tcBorders>
+            <w:tcMar>
+              <w:top w:w="50.0" w:type="dxa"/>
+              <w:left w:w="100.0" w:type="dxa"/>
+              <w:bottom w:w="50.0" w:type="dxa"/>
+              <w:right w:w="100.0" w:type="dxa"/>
+            </w:tcMar>
+            <w:vAlign w:val="top"/>
+          </w:tcPr>
+          <w:p>
+            <w:pPr>
+              <w:spacing w:after="20" w:lineRule="auto"/>
+              <w:rPr/>
+            </w:pPr>
+            <w:r>
+              <w:rPr>
+                <w:rFonts w:ascii="Arial" w:cs="Arial" w:eastAsia="Arial" w:hAnsi="Arial"/>
+                <w:sz w:val="21"/>
+                <w:szCs w:val="21"/>
+                <w:rtl w:val="0"/>
+              </w:rPr>
+              <w:t xml:space="preserve">authGuard</w:t>
             </w:r>
             <w:r>
               <w:rPr>
@@ -12264,44 +12576,512 @@
                 <w:szCs w:val="21"/>
                 <w:rtl w:val="0"/>
               </w:rPr>
-              <w:t xml:space="preserve">/admin/...</w:t>
-            </w:r>
-            <w:r>
-              <w:rPr>
-                <w:rtl w:val="0"/>
-              </w:rPr>
-            </w:r>
-          </w:p>
-        </w:tc>
-        <w:tc>
-          <w:tcPr>
-            <w:tcBorders>
-              <w:top w:color="000000" w:space="0" w:sz="4" w:val="single"/>
-              <w:left w:color="000000" w:space="0" w:sz="4" w:val="single"/>
-              <w:bottom w:color="000000" w:space="0" w:sz="4" w:val="single"/>
-              <w:right w:color="000000" w:space="0" w:sz="4" w:val="single"/>
-            </w:tcBorders>
-            <w:tcMar>
-              <w:top w:w="50.0" w:type="dxa"/>
-              <w:left w:w="100.0" w:type="dxa"/>
-              <w:bottom w:w="50.0" w:type="dxa"/>
-              <w:right w:w="100.0" w:type="dxa"/>
-            </w:tcMar>
-            <w:vAlign w:val="top"/>
-          </w:tcPr>
-          <w:p>
-            <w:pPr>
-              <w:spacing w:after="20" w:lineRule="auto"/>
-              <w:rPr/>
-            </w:pPr>
-            <w:r>
-              <w:rPr>
-                <w:rFonts w:ascii="Arial" w:cs="Arial" w:eastAsia="Arial" w:hAnsi="Arial"/>
-                <w:sz w:val="21"/>
-                <w:szCs w:val="21"/>
-                <w:rtl w:val="0"/>
-              </w:rPr>
-              <w:t xml:space="preserve">login-admin, gestion-lugares</w:t>
+              <w:t xml:space="preserve">/perfil/mis-tickets</w:t>
+            </w:r>
+            <w:r>
+              <w:rPr>
+                <w:rtl w:val="0"/>
+              </w:rPr>
+            </w:r>
+          </w:p>
+        </w:tc>
+        <w:tc>
+          <w:tcPr>
+            <w:tcBorders>
+              <w:top w:color="000000" w:space="0" w:sz="4" w:val="single"/>
+              <w:left w:color="000000" w:space="0" w:sz="4" w:val="single"/>
+              <w:bottom w:color="000000" w:space="0" w:sz="4" w:val="single"/>
+              <w:right w:color="000000" w:space="0" w:sz="4" w:val="single"/>
+            </w:tcBorders>
+            <w:tcMar>
+              <w:top w:w="50.0" w:type="dxa"/>
+              <w:left w:w="100.0" w:type="dxa"/>
+              <w:bottom w:w="50.0" w:type="dxa"/>
+              <w:right w:w="100.0" w:type="dxa"/>
+            </w:tcMar>
+            <w:vAlign w:val="top"/>
+          </w:tcPr>
+          <w:p>
+            <w:pPr>
+              <w:spacing w:after="20" w:lineRule="auto"/>
+              <w:rPr/>
+            </w:pPr>
+            <w:r>
+              <w:rPr>
+                <w:rFonts w:ascii="Arial" w:cs="Arial" w:eastAsia="Arial" w:hAnsi="Arial"/>
+                <w:sz w:val="21"/>
+                <w:szCs w:val="21"/>
+                <w:rtl w:val="0"/>
+              </w:rPr>
+              <w:t xml:space="preserve">mis-tickets</w:t>
+            </w:r>
+            <w:r>
+              <w:rPr>
+                <w:rtl w:val="0"/>
+              </w:rPr>
+            </w:r>
+          </w:p>
+        </w:tc>
+        <w:tc>
+          <w:tcPr>
+            <w:tcBorders>
+              <w:top w:color="000000" w:space="0" w:sz="4" w:val="single"/>
+              <w:left w:color="000000" w:space="0" w:sz="4" w:val="single"/>
+              <w:bottom w:color="000000" w:space="0" w:sz="4" w:val="single"/>
+              <w:right w:color="000000" w:space="0" w:sz="4" w:val="single"/>
+            </w:tcBorders>
+            <w:tcMar>
+              <w:top w:w="50.0" w:type="dxa"/>
+              <w:left w:w="100.0" w:type="dxa"/>
+              <w:bottom w:w="50.0" w:type="dxa"/>
+              <w:right w:w="100.0" w:type="dxa"/>
+            </w:tcMar>
+            <w:vAlign w:val="top"/>
+          </w:tcPr>
+          <w:p>
+            <w:pPr>
+              <w:spacing w:after="20" w:lineRule="auto"/>
+              <w:rPr/>
+            </w:pPr>
+            <w:r>
+              <w:rPr>
+                <w:rFonts w:ascii="Arial" w:cs="Arial" w:eastAsia="Arial" w:hAnsi="Arial"/>
+                <w:sz w:val="21"/>
+                <w:szCs w:val="21"/>
+                <w:rtl w:val="0"/>
+              </w:rPr>
+              <w:t xml:space="preserve">authGuard</w:t>
+            </w:r>
+            <w:r>
+              <w:rPr>
+                <w:rtl w:val="0"/>
+              </w:rPr>
+            </w:r>
+          </w:p>
+        </w:tc>
+      </w:tr>
+      <w:tr>
+        <w:trPr>
+          <w:cantSplit w:val="1"/>
+          <w:tblHeader w:val="0"/>
+        </w:trPr>
+        <w:tc>
+          <w:tcPr>
+            <w:tcBorders>
+              <w:top w:color="000000" w:space="0" w:sz="4" w:val="single"/>
+              <w:left w:color="000000" w:space="0" w:sz="4" w:val="single"/>
+              <w:bottom w:color="000000" w:space="0" w:sz="4" w:val="single"/>
+              <w:right w:color="000000" w:space="0" w:sz="4" w:val="single"/>
+            </w:tcBorders>
+            <w:tcMar>
+              <w:top w:w="50.0" w:type="dxa"/>
+              <w:left w:w="100.0" w:type="dxa"/>
+              <w:bottom w:w="50.0" w:type="dxa"/>
+              <w:right w:w="100.0" w:type="dxa"/>
+            </w:tcMar>
+            <w:vAlign w:val="top"/>
+          </w:tcPr>
+          <w:p>
+            <w:pPr>
+              <w:spacing w:after="20" w:lineRule="auto"/>
+              <w:rPr/>
+            </w:pPr>
+            <w:r>
+              <w:rPr>
+                <w:rFonts w:ascii="Consolas" w:cs="Consolas" w:eastAsia="Consolas" w:hAnsi="Consolas"/>
+                <w:sz w:val="21"/>
+                <w:szCs w:val="21"/>
+                <w:rtl w:val="0"/>
+              </w:rPr>
+              <w:t xml:space="preserve">/perfil/configuracion</w:t>
+            </w:r>
+            <w:r>
+              <w:rPr>
+                <w:rtl w:val="0"/>
+              </w:rPr>
+            </w:r>
+          </w:p>
+        </w:tc>
+        <w:tc>
+          <w:tcPr>
+            <w:tcBorders>
+              <w:top w:color="000000" w:space="0" w:sz="4" w:val="single"/>
+              <w:left w:color="000000" w:space="0" w:sz="4" w:val="single"/>
+              <w:bottom w:color="000000" w:space="0" w:sz="4" w:val="single"/>
+              <w:right w:color="000000" w:space="0" w:sz="4" w:val="single"/>
+            </w:tcBorders>
+            <w:tcMar>
+              <w:top w:w="50.0" w:type="dxa"/>
+              <w:left w:w="100.0" w:type="dxa"/>
+              <w:bottom w:w="50.0" w:type="dxa"/>
+              <w:right w:w="100.0" w:type="dxa"/>
+            </w:tcMar>
+            <w:vAlign w:val="top"/>
+          </w:tcPr>
+          <w:p>
+            <w:pPr>
+              <w:spacing w:after="20" w:lineRule="auto"/>
+              <w:rPr/>
+            </w:pPr>
+            <w:r>
+              <w:rPr>
+                <w:rFonts w:ascii="Arial" w:cs="Arial" w:eastAsia="Arial" w:hAnsi="Arial"/>
+                <w:sz w:val="21"/>
+                <w:szCs w:val="21"/>
+                <w:rtl w:val="0"/>
+              </w:rPr>
+              <w:t xml:space="preserve">configuracion</w:t>
+            </w:r>
+            <w:r>
+              <w:rPr>
+                <w:rtl w:val="0"/>
+              </w:rPr>
+            </w:r>
+          </w:p>
+        </w:tc>
+        <w:tc>
+          <w:tcPr>
+            <w:tcBorders>
+              <w:top w:color="000000" w:space="0" w:sz="4" w:val="single"/>
+              <w:left w:color="000000" w:space="0" w:sz="4" w:val="single"/>
+              <w:bottom w:color="000000" w:space="0" w:sz="4" w:val="single"/>
+              <w:right w:color="000000" w:space="0" w:sz="4" w:val="single"/>
+            </w:tcBorders>
+            <w:tcMar>
+              <w:top w:w="50.0" w:type="dxa"/>
+              <w:left w:w="100.0" w:type="dxa"/>
+              <w:bottom w:w="50.0" w:type="dxa"/>
+              <w:right w:w="100.0" w:type="dxa"/>
+            </w:tcMar>
+            <w:vAlign w:val="top"/>
+          </w:tcPr>
+          <w:p>
+            <w:pPr>
+              <w:spacing w:after="20" w:lineRule="auto"/>
+              <w:rPr/>
+            </w:pPr>
+            <w:r>
+              <w:rPr>
+                <w:rFonts w:ascii="Arial" w:cs="Arial" w:eastAsia="Arial" w:hAnsi="Arial"/>
+                <w:sz w:val="21"/>
+                <w:szCs w:val="21"/>
+                <w:rtl w:val="0"/>
+              </w:rPr>
+              <w:t xml:space="preserve">authGuard</w:t>
+            </w:r>
+            <w:r>
+              <w:rPr>
+                <w:rtl w:val="0"/>
+              </w:rPr>
+            </w:r>
+          </w:p>
+        </w:tc>
+      </w:tr>
+      <w:tr>
+        <w:trPr>
+          <w:cantSplit w:val="1"/>
+          <w:tblHeader w:val="0"/>
+        </w:trPr>
+        <w:tc>
+          <w:tcPr>
+            <w:tcBorders>
+              <w:top w:color="000000" w:space="0" w:sz="4" w:val="single"/>
+              <w:left w:color="000000" w:space="0" w:sz="4" w:val="single"/>
+              <w:bottom w:color="000000" w:space="0" w:sz="4" w:val="single"/>
+              <w:right w:color="000000" w:space="0" w:sz="4" w:val="single"/>
+            </w:tcBorders>
+            <w:tcMar>
+              <w:top w:w="50.0" w:type="dxa"/>
+              <w:left w:w="100.0" w:type="dxa"/>
+              <w:bottom w:w="50.0" w:type="dxa"/>
+              <w:right w:w="100.0" w:type="dxa"/>
+            </w:tcMar>
+            <w:vAlign w:val="top"/>
+          </w:tcPr>
+          <w:p>
+            <w:pPr>
+              <w:spacing w:after="20" w:lineRule="auto"/>
+              <w:rPr/>
+            </w:pPr>
+            <w:r>
+              <w:rPr>
+                <w:rFonts w:ascii="Consolas" w:cs="Consolas" w:eastAsia="Consolas" w:hAnsi="Consolas"/>
+                <w:sz w:val="21"/>
+                <w:szCs w:val="21"/>
+                <w:rtl w:val="0"/>
+              </w:rPr>
+              <w:t xml:space="preserve">/auth/login, /auth/registro</w:t>
+            </w:r>
+            <w:r>
+              <w:rPr>
+                <w:rtl w:val="0"/>
+              </w:rPr>
+            </w:r>
+          </w:p>
+        </w:tc>
+        <w:tc>
+          <w:tcPr>
+            <w:tcBorders>
+              <w:top w:color="000000" w:space="0" w:sz="4" w:val="single"/>
+              <w:left w:color="000000" w:space="0" w:sz="4" w:val="single"/>
+              <w:bottom w:color="000000" w:space="0" w:sz="4" w:val="single"/>
+              <w:right w:color="000000" w:space="0" w:sz="4" w:val="single"/>
+            </w:tcBorders>
+            <w:tcMar>
+              <w:top w:w="50.0" w:type="dxa"/>
+              <w:left w:w="100.0" w:type="dxa"/>
+              <w:bottom w:w="50.0" w:type="dxa"/>
+              <w:right w:w="100.0" w:type="dxa"/>
+            </w:tcMar>
+            <w:vAlign w:val="top"/>
+          </w:tcPr>
+          <w:p>
+            <w:pPr>
+              <w:spacing w:after="20" w:lineRule="auto"/>
+              <w:rPr/>
+            </w:pPr>
+            <w:r>
+              <w:rPr>
+                <w:rFonts w:ascii="Arial" w:cs="Arial" w:eastAsia="Arial" w:hAnsi="Arial"/>
+                <w:sz w:val="21"/>
+                <w:szCs w:val="21"/>
+                <w:rtl w:val="0"/>
+              </w:rPr>
+              <w:t xml:space="preserve">login, registro</w:t>
+            </w:r>
+            <w:r>
+              <w:rPr>
+                <w:rtl w:val="0"/>
+              </w:rPr>
+            </w:r>
+          </w:p>
+        </w:tc>
+        <w:tc>
+          <w:tcPr>
+            <w:tcBorders>
+              <w:top w:color="000000" w:space="0" w:sz="4" w:val="single"/>
+              <w:left w:color="000000" w:space="0" w:sz="4" w:val="single"/>
+              <w:bottom w:color="000000" w:space="0" w:sz="4" w:val="single"/>
+              <w:right w:color="000000" w:space="0" w:sz="4" w:val="single"/>
+            </w:tcBorders>
+            <w:tcMar>
+              <w:top w:w="50.0" w:type="dxa"/>
+              <w:left w:w="100.0" w:type="dxa"/>
+              <w:bottom w:w="50.0" w:type="dxa"/>
+              <w:right w:w="100.0" w:type="dxa"/>
+            </w:tcMar>
+            <w:vAlign w:val="top"/>
+          </w:tcPr>
+          <w:p>
+            <w:pPr>
+              <w:spacing w:after="20" w:lineRule="auto"/>
+              <w:rPr/>
+            </w:pPr>
+            <w:r>
+              <w:rPr>
+                <w:rFonts w:ascii="Arial" w:cs="Arial" w:eastAsia="Arial" w:hAnsi="Arial"/>
+                <w:sz w:val="21"/>
+                <w:szCs w:val="21"/>
+                <w:rtl w:val="0"/>
+              </w:rPr>
+              <w:t xml:space="preserve">Sin guard</w:t>
+            </w:r>
+            <w:r>
+              <w:rPr>
+                <w:rtl w:val="0"/>
+              </w:rPr>
+            </w:r>
+          </w:p>
+        </w:tc>
+      </w:tr>
+      <w:tr>
+        <w:trPr>
+          <w:cantSplit w:val="1"/>
+          <w:tblHeader w:val="0"/>
+        </w:trPr>
+        <w:tc>
+          <w:tcPr>
+            <w:tcBorders>
+              <w:top w:color="000000" w:space="0" w:sz="4" w:val="single"/>
+              <w:left w:color="000000" w:space="0" w:sz="4" w:val="single"/>
+              <w:bottom w:color="000000" w:space="0" w:sz="4" w:val="single"/>
+              <w:right w:color="000000" w:space="0" w:sz="4" w:val="single"/>
+            </w:tcBorders>
+            <w:tcMar>
+              <w:top w:w="50.0" w:type="dxa"/>
+              <w:left w:w="100.0" w:type="dxa"/>
+              <w:bottom w:w="50.0" w:type="dxa"/>
+              <w:right w:w="100.0" w:type="dxa"/>
+            </w:tcMar>
+            <w:vAlign w:val="top"/>
+          </w:tcPr>
+          <w:p>
+            <w:pPr>
+              <w:spacing w:after="20" w:lineRule="auto"/>
+              <w:rPr/>
+            </w:pPr>
+            <w:r>
+              <w:rPr>
+                <w:rFonts w:ascii="Consolas" w:cs="Consolas" w:eastAsia="Consolas" w:hAnsi="Consolas"/>
+                <w:sz w:val="21"/>
+                <w:szCs w:val="21"/>
+                <w:rtl w:val="0"/>
+              </w:rPr>
+              <w:t xml:space="preserve">/auth/recuperar, /auth/restablecer</w:t>
+            </w:r>
+            <w:r>
+              <w:rPr>
+                <w:rtl w:val="0"/>
+              </w:rPr>
+            </w:r>
+          </w:p>
+        </w:tc>
+        <w:tc>
+          <w:tcPr>
+            <w:tcBorders>
+              <w:top w:color="000000" w:space="0" w:sz="4" w:val="single"/>
+              <w:left w:color="000000" w:space="0" w:sz="4" w:val="single"/>
+              <w:bottom w:color="000000" w:space="0" w:sz="4" w:val="single"/>
+              <w:right w:color="000000" w:space="0" w:sz="4" w:val="single"/>
+            </w:tcBorders>
+            <w:tcMar>
+              <w:top w:w="50.0" w:type="dxa"/>
+              <w:left w:w="100.0" w:type="dxa"/>
+              <w:bottom w:w="50.0" w:type="dxa"/>
+              <w:right w:w="100.0" w:type="dxa"/>
+            </w:tcMar>
+            <w:vAlign w:val="top"/>
+          </w:tcPr>
+          <w:p>
+            <w:pPr>
+              <w:spacing w:after="20" w:lineRule="auto"/>
+              <w:rPr/>
+            </w:pPr>
+            <w:r>
+              <w:rPr>
+                <w:rFonts w:ascii="Arial" w:cs="Arial" w:eastAsia="Arial" w:hAnsi="Arial"/>
+                <w:sz w:val="21"/>
+                <w:szCs w:val="21"/>
+                <w:rtl w:val="0"/>
+              </w:rPr>
+              <w:t xml:space="preserve">recuperar-password, restablecer-password</w:t>
+            </w:r>
+            <w:r>
+              <w:rPr>
+                <w:rtl w:val="0"/>
+              </w:rPr>
+            </w:r>
+          </w:p>
+        </w:tc>
+        <w:tc>
+          <w:tcPr>
+            <w:tcBorders>
+              <w:top w:color="000000" w:space="0" w:sz="4" w:val="single"/>
+              <w:left w:color="000000" w:space="0" w:sz="4" w:val="single"/>
+              <w:bottom w:color="000000" w:space="0" w:sz="4" w:val="single"/>
+              <w:right w:color="000000" w:space="0" w:sz="4" w:val="single"/>
+            </w:tcBorders>
+            <w:tcMar>
+              <w:top w:w="50.0" w:type="dxa"/>
+              <w:left w:w="100.0" w:type="dxa"/>
+              <w:bottom w:w="50.0" w:type="dxa"/>
+              <w:right w:w="100.0" w:type="dxa"/>
+            </w:tcMar>
+            <w:vAlign w:val="top"/>
+          </w:tcPr>
+          <w:p>
+            <w:pPr>
+              <w:spacing w:after="20" w:lineRule="auto"/>
+              <w:rPr/>
+            </w:pPr>
+            <w:r>
+              <w:rPr>
+                <w:rFonts w:ascii="Arial" w:cs="Arial" w:eastAsia="Arial" w:hAnsi="Arial"/>
+                <w:sz w:val="21"/>
+                <w:szCs w:val="21"/>
+                <w:rtl w:val="0"/>
+              </w:rPr>
+              <w:t xml:space="preserve">Sin guard</w:t>
+            </w:r>
+            <w:r>
+              <w:rPr>
+                <w:rtl w:val="0"/>
+              </w:rPr>
+            </w:r>
+          </w:p>
+        </w:tc>
+      </w:tr>
+      <w:tr>
+        <w:trPr>
+          <w:cantSplit w:val="1"/>
+          <w:tblHeader w:val="0"/>
+        </w:trPr>
+        <w:tc>
+          <w:tcPr>
+            <w:tcBorders>
+              <w:top w:color="000000" w:space="0" w:sz="4" w:val="single"/>
+              <w:left w:color="000000" w:space="0" w:sz="4" w:val="single"/>
+              <w:bottom w:color="000000" w:space="0" w:sz="4" w:val="single"/>
+              <w:right w:color="000000" w:space="0" w:sz="4" w:val="single"/>
+            </w:tcBorders>
+            <w:tcMar>
+              <w:top w:w="50.0" w:type="dxa"/>
+              <w:left w:w="100.0" w:type="dxa"/>
+              <w:bottom w:w="50.0" w:type="dxa"/>
+              <w:right w:w="100.0" w:type="dxa"/>
+            </w:tcMar>
+            <w:vAlign w:val="top"/>
+          </w:tcPr>
+          <w:p>
+            <w:pPr>
+              <w:spacing w:after="20" w:lineRule="auto"/>
+              <w:rPr/>
+            </w:pPr>
+            <w:r>
+              <w:rPr>
+                <w:rFonts w:ascii="Consolas" w:cs="Consolas" w:eastAsia="Consolas" w:hAnsi="Consolas"/>
+                <w:sz w:val="21"/>
+                <w:szCs w:val="21"/>
+                <w:rtl w:val="0"/>
+              </w:rPr>
+              <w:t xml:space="preserve">/admin/gestion-lugares</w:t>
+            </w:r>
+            <w:r>
+              <w:rPr>
+                <w:rtl w:val="0"/>
+              </w:rPr>
+            </w:r>
+          </w:p>
+        </w:tc>
+        <w:tc>
+          <w:tcPr>
+            <w:tcBorders>
+              <w:top w:color="000000" w:space="0" w:sz="4" w:val="single"/>
+              <w:left w:color="000000" w:space="0" w:sz="4" w:val="single"/>
+              <w:bottom w:color="000000" w:space="0" w:sz="4" w:val="single"/>
+              <w:right w:color="000000" w:space="0" w:sz="4" w:val="single"/>
+            </w:tcBorders>
+            <w:tcMar>
+              <w:top w:w="50.0" w:type="dxa"/>
+              <w:left w:w="100.0" w:type="dxa"/>
+              <w:bottom w:w="50.0" w:type="dxa"/>
+              <w:right w:w="100.0" w:type="dxa"/>
+            </w:tcMar>
+            <w:vAlign w:val="top"/>
+          </w:tcPr>
+          <w:p>
+            <w:pPr>
+              <w:spacing w:after="20" w:lineRule="auto"/>
+              <w:rPr/>
+            </w:pPr>
+            <w:r>
+              <w:rPr>
+                <w:rFonts w:ascii="Arial" w:cs="Arial" w:eastAsia="Arial" w:hAnsi="Arial"/>
+                <w:sz w:val="21"/>
+                <w:szCs w:val="21"/>
+                <w:rtl w:val="0"/>
+              </w:rPr>
+              <w:t xml:space="preserve">gestion-lugares</w:t>
             </w:r>
             <w:r>
               <w:rPr>
@@ -12372,7 +13152,7 @@
           <w:szCs w:val="22"/>
           <w:rtl w:val="0"/>
         </w:rPr>
-        <w:t xml:space="preserve">La ruta raíz redirige a /tabs/inicio. El catálogo completo y el historial de medallas quedan fuera de las pestañas de forma deliberada: Inicio muestra solo una selección de recomendados y un acceso al catálogo, y el historial se alcanza desde el perfil.</w:t>
+        <w:t xml:space="preserve">La ruta raíz y cualquier ruta inexistente redirigen a /tabs/inicio. No existe una pantalla de inicio de sesión exclusiva para el administrador: inicia sesión desde /auth/login y, si su cuenta tiene es_admin = true, el perfil muestra el acceso al panel, protegido por adminGuard. El catálogo completo y el historial de medallas quedan fuera de las pestañas de forma deliberada: Inicio muestra solo una selección de recomendados y un acceso al catálogo, y el historial se alcanza desde el perfil.</w:t>
       </w:r>
       <w:r>
         <w:rPr>
@@ -12666,7 +13446,7 @@
                 <w:szCs w:val="21"/>
                 <w:rtl w:val="0"/>
               </w:rPr>
-              <w:t xml:space="preserve">Archivos SQL numerados de forma secuencial, aplicados en ese mismo orden desde el SQL Editor de Supabase</w:t>
+              <w:t xml:space="preserve">Archivos SQL numerados de forma secuencial (001, 002, …), aplicados en ese mismo orden desde el SQL Editor de Supabase</w:t>
             </w:r>
             <w:r>
               <w:rPr>
@@ -12746,7 +13526,7 @@
                 <w:szCs w:val="21"/>
                 <w:rtl w:val="0"/>
               </w:rPr>
-              <w:t xml:space="preserve">Prefijo fn_ para las funciones; el disparador de medallas y el de protección del rol son parte del esquema versionado</w:t>
+              <w:t xml:space="preserve">Prefijo fn_ para las funciones; el disparador de medallas y el de protección del rol son parte del esquema versionado. La función lugares_cercanos es anterior a la convención y conserva su nombre para no romper el cliente</w:t>
             </w:r>
             <w:r>
               <w:rPr>
@@ -13927,7 +14707,7 @@
                 <w:szCs w:val="21"/>
                 <w:rtl w:val="0"/>
               </w:rPr>
-              <w:t xml:space="preserve">auth-guard.ts, detalle-lugar.page.ts</w:t>
+              <w:t xml:space="preserve">auth-guard.ts, detalle-lugar.component.ts</w:t>
             </w:r>
             <w:r>
               <w:rPr>
@@ -14639,6 +15419,11 @@
         </w:rPr>
         <w:t xml:space="preserve">El proyecto no usa módulos NgModule. Cada componente declara manualmente su propio arreglo imports con los componentes de Ionic que utiliza; omitirlo es la causa más frecuente de que un control no se renderice.</w:t>
       </w:r>
+      <w:r>
+        <w:rPr>
+          <w:rtl w:val="0"/>
+        </w:rPr>
+      </w:r>
     </w:p>
     <w:p>
       <w:pPr>
@@ -14701,6 +15486,11 @@
         </w:rPr>
         <w:t xml:space="preserve">En los componentes que viven dentro de las pestañas, la carga de datos se hace en ionViewWillEnter y no en ngOnInit, porque Ionic mantiene la vista en caché y ngOnInit no vuelve a ejecutarse al regresar a la pestaña.</w:t>
       </w:r>
+      <w:r>
+        <w:rPr>
+          <w:rtl w:val="0"/>
+        </w:rPr>
+      </w:r>
     </w:p>
     <w:p>
       <w:pPr>
@@ -14763,6 +15553,11 @@
         </w:rPr>
         <w:t xml:space="preserve">Los formularios dentro de un ion-modal se estructuran con ion-header, ion-content e ion-footer. Evita los defectos de posicionamiento que provocan las transiciones basadas en transform de Ionic.</w:t>
       </w:r>
+      <w:r>
+        <w:rPr>
+          <w:rtl w:val="0"/>
+        </w:rPr>
+      </w:r>
     </w:p>
     <w:p>
       <w:pPr>
@@ -14825,6 +15620,11 @@
         </w:rPr>
         <w:t xml:space="preserve">El mapa se inicializa en didPresent y se destruye en willDismiss o en ngOnDestroy. No inicializarlo después de que la vista esté presente deja el contenedor sin dimensiones.</w:t>
       </w:r>
+      <w:r>
+        <w:rPr>
+          <w:rtl w:val="0"/>
+        </w:rPr>
+      </w:r>
     </w:p>
     <w:p>
       <w:pPr>
@@ -14886,6 +15686,11 @@
           <w:rtl w:val="0"/>
         </w:rPr>
         <w:t xml:space="preserve">Ningún componente consulta Supabase directamente: siempre lo hace a través del servicio de su dominio, que a su vez usa el wrapper único del cliente.</w:t>
+      </w:r>
+      <w:r>
+        <w:rPr>
+          <w:rtl w:val="0"/>
+        </w:rPr>
       </w:r>
     </w:p>
     <w:p>
@@ -15273,7 +16078,7 @@
                 <w:szCs w:val="21"/>
                 <w:rtl w:val="0"/>
               </w:rPr>
-              <w:t xml:space="preserve">#BD5B34</w:t>
+              <w:t xml:space="preserve">#C1622D</w:t>
             </w:r>
             <w:r>
               <w:rPr>
@@ -15390,7 +16195,7 @@
                 <w:szCs w:val="21"/>
                 <w:rtl w:val="0"/>
               </w:rPr>
-              <w:t xml:space="preserve">#4B7A5A</w:t>
+              <w:t xml:space="preserve">#5A8A6E</w:t>
             </w:r>
             <w:r>
               <w:rPr>
@@ -15507,44 +16312,44 @@
                 <w:szCs w:val="21"/>
                 <w:rtl w:val="0"/>
               </w:rPr>
-              <w:t xml:space="preserve">#F7F4EF</w:t>
-            </w:r>
-            <w:r>
-              <w:rPr>
-                <w:rtl w:val="0"/>
-              </w:rPr>
-            </w:r>
-          </w:p>
-        </w:tc>
-        <w:tc>
-          <w:tcPr>
-            <w:tcBorders>
-              <w:top w:color="000000" w:space="0" w:sz="4" w:val="single"/>
-              <w:left w:color="000000" w:space="0" w:sz="4" w:val="single"/>
-              <w:bottom w:color="000000" w:space="0" w:sz="4" w:val="single"/>
-              <w:right w:color="000000" w:space="0" w:sz="4" w:val="single"/>
-            </w:tcBorders>
-            <w:tcMar>
-              <w:top w:w="50.0" w:type="dxa"/>
-              <w:left w:w="100.0" w:type="dxa"/>
-              <w:bottom w:w="50.0" w:type="dxa"/>
-              <w:right w:w="100.0" w:type="dxa"/>
-            </w:tcMar>
-            <w:vAlign w:val="top"/>
-          </w:tcPr>
-          <w:p>
-            <w:pPr>
-              <w:spacing w:after="20" w:lineRule="auto"/>
-              <w:rPr/>
-            </w:pPr>
-            <w:r>
-              <w:rPr>
-                <w:rFonts w:ascii="Arial" w:cs="Arial" w:eastAsia="Arial" w:hAnsi="Arial"/>
-                <w:sz w:val="21"/>
-                <w:szCs w:val="21"/>
-                <w:rtl w:val="0"/>
-              </w:rPr>
-              <w:t xml:space="preserve">Fondo cálido general de la aplicación</w:t>
+              <w:t xml:space="preserve">#FFFFFF (claro) / #1C1720 (oscuro)</w:t>
+            </w:r>
+            <w:r>
+              <w:rPr>
+                <w:rtl w:val="0"/>
+              </w:rPr>
+            </w:r>
+          </w:p>
+        </w:tc>
+        <w:tc>
+          <w:tcPr>
+            <w:tcBorders>
+              <w:top w:color="000000" w:space="0" w:sz="4" w:val="single"/>
+              <w:left w:color="000000" w:space="0" w:sz="4" w:val="single"/>
+              <w:bottom w:color="000000" w:space="0" w:sz="4" w:val="single"/>
+              <w:right w:color="000000" w:space="0" w:sz="4" w:val="single"/>
+            </w:tcBorders>
+            <w:tcMar>
+              <w:top w:w="50.0" w:type="dxa"/>
+              <w:left w:w="100.0" w:type="dxa"/>
+              <w:bottom w:w="50.0" w:type="dxa"/>
+              <w:right w:w="100.0" w:type="dxa"/>
+            </w:tcMar>
+            <w:vAlign w:val="top"/>
+          </w:tcPr>
+          <w:p>
+            <w:pPr>
+              <w:spacing w:after="20" w:lineRule="auto"/>
+              <w:rPr/>
+            </w:pPr>
+            <w:r>
+              <w:rPr>
+                <w:rFonts w:ascii="Arial" w:cs="Arial" w:eastAsia="Arial" w:hAnsi="Arial"/>
+                <w:sz w:val="21"/>
+                <w:szCs w:val="21"/>
+                <w:rtl w:val="0"/>
+              </w:rPr>
+              <w:t xml:space="preserve">Fondo general de la aplicación en cada modo</w:t>
             </w:r>
             <w:r>
               <w:rPr>
@@ -15832,7 +16637,7 @@
           <w:szCs w:val="22"/>
           <w:rtl w:val="0"/>
         </w:rPr>
-        <w:t xml:space="preserve">Los contrastes y tamaños de fuente deben cumplir el nivel AA de las pautas WCAG, considerando el uso de la aplicación en exteriores (RNF-12).</w:t>
+        <w:t xml:space="preserve">La aplicación ofrece modo claro y modo oscuro: el servicio Theme aplica la clase tema-oscuro sobre el documento y recuerda la preferencia en el almacenamiento local. Los contrastes y tamaños de fuente deben cumplir el nivel AA de las pautas WCAG en ambos modos, considerando el uso de la aplicación en exteriores (RNF-12).</w:t>
       </w:r>
       <w:r>
         <w:rPr>
@@ -15906,6 +16711,11 @@
         </w:rPr>
         <w:t xml:space="preserve">Los errores devueltos por Supabase son objetos planos y no instancias de Error: deben comprobarse con 'message' in error y nunca con instanceof Error.</w:t>
       </w:r>
+      <w:r>
+        <w:rPr>
+          <w:rtl w:val="0"/>
+        </w:rPr>
+      </w:r>
     </w:p>
     <w:p>
       <w:pPr>
@@ -15949,6 +16759,11 @@
         </w:rPr>
         <w:t xml:space="preserve">Todo error se traduce a un mensaje comprensible para un usuario sin conocimientos técnicos; no se muestran códigos ni trazas.</w:t>
       </w:r>
+      <w:r>
+        <w:rPr>
+          <w:rtl w:val="0"/>
+        </w:rPr>
+      </w:r>
     </w:p>
     <w:p>
       <w:pPr>
@@ -15992,6 +16807,11 @@
         </w:rPr>
         <w:t xml:space="preserve">Ninguna operación puede dejar la aplicación en estado de carga indefinida: ante un error, la animación de carga se oculta y se muestra el mensaje correspondiente (RF-12).</w:t>
       </w:r>
+      <w:r>
+        <w:rPr>
+          <w:rtl w:val="0"/>
+        </w:rPr>
+      </w:r>
     </w:p>
     <w:p>
       <w:pPr>
@@ -16035,6 +16855,11 @@
         </w:rPr>
         <w:t xml:space="preserve">Ante un error al guardar, se mantienen los datos anteriores y se informa al usuario, según los criterios de aceptación de la ERS.</w:t>
       </w:r>
+      <w:r>
+        <w:rPr>
+          <w:rtl w:val="0"/>
+        </w:rPr>
+      </w:r>
     </w:p>
     <w:p>
       <w:pPr>
@@ -16102,6 +16927,11 @@
         </w:rPr>
         <w:t xml:space="preserve">Las credenciales de los servicios no se versionan: los archivos de entorno están en .gitignore y se comparten por un canal seguro entre los integrantes (C-07).</w:t>
       </w:r>
+      <w:r>
+        <w:rPr>
+          <w:rtl w:val="0"/>
+        </w:rPr>
+      </w:r>
     </w:p>
     <w:p>
       <w:pPr>
@@ -16145,6 +16975,11 @@
         </w:rPr>
         <w:t xml:space="preserve">El control de acceso se implementa en la base de datos mediante políticas RLS; los guards del cliente son una capa de conveniencia, no el mecanismo de seguridad (RNF-07).</w:t>
       </w:r>
+      <w:r>
+        <w:rPr>
+          <w:rtl w:val="0"/>
+        </w:rPr>
+      </w:r>
     </w:p>
     <w:p>
       <w:pPr>
@@ -16188,6 +17023,11 @@
         </w:rPr>
         <w:t xml:space="preserve">Las contraseñas nunca se almacenan ni se manipulan en el cliente: su gestión y cifrado quedan a cargo de Supabase Auth (RNF-06).</w:t>
       </w:r>
+      <w:r>
+        <w:rPr>
+          <w:rtl w:val="0"/>
+        </w:rPr>
+      </w:r>
     </w:p>
     <w:p>
       <w:pPr>
@@ -16230,6 +17070,11 @@
           <w:rtl w:val="0"/>
         </w:rPr>
         <w:t xml:space="preserve">Las consultas que requieren cruzar datos de varios usuarios se resuelven mediante funciones security definer acotadas, nunca relajando las políticas de la tabla.</w:t>
+      </w:r>
+      <w:r>
+        <w:rPr>
+          <w:rtl w:val="0"/>
+        </w:rPr>
       </w:r>
     </w:p>
     <w:p>
@@ -16497,6 +17342,11 @@
         </w:rPr>
         <w:t xml:space="preserve">El trabajo se realiza siempre en una rama feature/ o fix/ creada desde develop; no se hacen commits directos sobre develop ni sobre main.</w:t>
       </w:r>
+      <w:r>
+        <w:rPr>
+          <w:rtl w:val="0"/>
+        </w:rPr>
+      </w:r>
     </w:p>
     <w:p>
       <w:pPr>
@@ -16540,6 +17390,11 @@
         </w:rPr>
         <w:t xml:space="preserve">Los tipos de commit habituales son feat para funcionalidad nueva y fix para correcciones.</w:t>
       </w:r>
+      <w:r>
+        <w:rPr>
+          <w:rtl w:val="0"/>
+        </w:rPr>
+      </w:r>
     </w:p>
     <w:p>
       <w:pPr>
@@ -16583,6 +17438,11 @@
         </w:rPr>
         <w:t xml:space="preserve">Los mensajes se escriben de forma concisa y directa, sin acentos ni ñ en los nombres de rama.</w:t>
       </w:r>
+      <w:r>
+        <w:rPr>
+          <w:rtl w:val="0"/>
+        </w:rPr>
+      </w:r>
     </w:p>
     <w:p>
       <w:pPr>
@@ -16626,6 +17486,11 @@
         </w:rPr>
         <w:t xml:space="preserve">Antes de integrar a develop, el código debe compilar sin errores.</w:t>
       </w:r>
+      <w:r>
+        <w:rPr>
+          <w:rtl w:val="0"/>
+        </w:rPr>
+      </w:r>
     </w:p>
     <w:p>
       <w:pPr>
@@ -16693,6 +17558,11 @@
         </w:rPr>
         <w:t xml:space="preserve">Cada servicio y cada método público llevan un comentario breve que explica su propósito cuando este no es evidente a partir del nombre.</w:t>
       </w:r>
+      <w:r>
+        <w:rPr>
+          <w:rtl w:val="0"/>
+        </w:rPr>
+      </w:r>
     </w:p>
     <w:p>
       <w:pPr>
@@ -16736,6 +17606,11 @@
         </w:rPr>
         <w:t xml:space="preserve">No se dejan comentarios de versiones anteriores, código comentado ni restos de pruebas en el código integrado.</w:t>
       </w:r>
+      <w:r>
+        <w:rPr>
+          <w:rtl w:val="0"/>
+        </w:rPr>
+      </w:r>
     </w:p>
     <w:p>
       <w:pPr>
@@ -16779,6 +17654,11 @@
         </w:rPr>
         <w:t xml:space="preserve">Los archivos .spec.ts incluyen mocks de todos los servicios inyectados, para evitar errores de inyección al ejecutar las pruebas.</w:t>
       </w:r>
+      <w:r>
+        <w:rPr>
+          <w:rtl w:val="0"/>
+        </w:rPr>
+      </w:r>
     </w:p>
     <w:p>
       <w:pPr>
@@ -16822,6 +17702,11 @@
         </w:rPr>
         <w:t xml:space="preserve">La estructura modular y la documentación básica son la evidencia verificable de RNF-10.</w:t>
       </w:r>
+      <w:r>
+        <w:rPr>
+          <w:rtl w:val="0"/>
+        </w:rPr>
+      </w:r>
     </w:p>
     <w:p>
       <w:pPr>
@@ -16909,6 +17794,11 @@
         </w:rPr>
         <w:t xml:space="preserve">El requisito asociado satisface todos sus criterios de aceptación definidos en la ERS.</w:t>
       </w:r>
+      <w:r>
+        <w:rPr>
+          <w:rtl w:val="0"/>
+        </w:rPr>
+      </w:r>
     </w:p>
     <w:p>
       <w:pPr>
@@ -16952,6 +17842,11 @@
         </w:rPr>
         <w:t xml:space="preserve">El código está integrado en la rama de desarrollo y compila sin errores.</w:t>
       </w:r>
+      <w:r>
+        <w:rPr>
+          <w:rtl w:val="0"/>
+        </w:rPr>
+      </w:r>
     </w:p>
     <w:p>
       <w:pPr>
@@ -16995,6 +17890,11 @@
         </w:rPr>
         <w:t xml:space="preserve">El comportamiento fue verificado en un dispositivo o emulador Android.</w:t>
       </w:r>
+      <w:r>
+        <w:rPr>
+          <w:rtl w:val="0"/>
+        </w:rPr>
+      </w:r>
     </w:p>
     <w:p>
       <w:pPr>
@@ -17038,6 +17938,11 @@
         </w:rPr>
         <w:t xml:space="preserve">Los casos de error previstos muestran mensajes comprensibles y no dejan la aplicación en estado indeterminado.</w:t>
       </w:r>
+      <w:r>
+        <w:rPr>
+          <w:rtl w:val="0"/>
+        </w:rPr>
+      </w:r>
     </w:p>
     <w:p>
       <w:pPr>
@@ -17081,6 +17986,11 @@
         </w:rPr>
         <w:t xml:space="preserve">Las reglas de acceso aplicables fueron verificadas con una cuenta sin privilegios.</w:t>
       </w:r>
+      <w:r>
+        <w:rPr>
+          <w:rtl w:val="0"/>
+        </w:rPr>
+      </w:r>
     </w:p>
     <w:p>
       <w:pPr>
@@ -17123,6 +18033,11 @@
           <w:rtl w:val="0"/>
         </w:rPr>
         <w:t xml:space="preserve">El código respeta las convenciones de este documento y la documentación afectada quedó actualizada.</w:t>
+      </w:r>
+      <w:r>
+        <w:rPr>
+          <w:rtl w:val="0"/>
+        </w:rPr>
       </w:r>
     </w:p>
     <w:p>
@@ -17429,7 +18344,7 @@
                 <w:szCs w:val="18"/>
                 <w:rtl w:val="0"/>
               </w:rPr>
-              <w:t xml:space="preserve">9. npx cap sync android        # sincronización del proyecto nativo</w:t>
+              <w:t xml:space="preserve">9.  npx cap add android      # solo la primera vez: android/ no se versiona</w:t>
             </w:r>
             <w:r>
               <w:rPr>
@@ -17449,7 +18364,27 @@
                 <w:szCs w:val="18"/>
                 <w:rtl w:val="0"/>
               </w:rPr>
-              <w:t xml:space="preserve">10. Abrir la carpeta android/ en Android Studio y ejecutar en el emulador.</w:t>
+              <w:t xml:space="preserve">10. npx cap sync android     # sincronización del proyecto nativo</w:t>
+            </w:r>
+            <w:r>
+              <w:rPr>
+                <w:rtl w:val="0"/>
+              </w:rPr>
+            </w:r>
+          </w:p>
+          <w:p>
+            <w:pPr>
+              <w:spacing w:after="0" w:line="240" w:lineRule="auto"/>
+              <w:rPr/>
+            </w:pPr>
+            <w:r>
+              <w:rPr>
+                <w:rFonts w:ascii="Consolas" w:cs="Consolas" w:eastAsia="Consolas" w:hAnsi="Consolas"/>
+                <w:sz w:val="18"/>
+                <w:szCs w:val="18"/>
+                <w:rtl w:val="0"/>
+              </w:rPr>
+              <w:t xml:space="preserve">11. Abrir la carpeta android/ en Android Studio y ejecutar en el emulador.</w:t>
             </w:r>
             <w:r>
               <w:rPr>
@@ -18384,81 +19319,81 @@
                 <w:szCs w:val="21"/>
                 <w:rtl w:val="0"/>
               </w:rPr>
-              <w:t xml:space="preserve">RNF-11</w:t>
-            </w:r>
-            <w:r>
-              <w:rPr>
-                <w:rtl w:val="0"/>
-              </w:rPr>
-            </w:r>
-          </w:p>
-        </w:tc>
-        <w:tc>
-          <w:tcPr>
-            <w:tcBorders>
-              <w:top w:color="000000" w:space="0" w:sz="4" w:val="single"/>
-              <w:left w:color="000000" w:space="0" w:sz="4" w:val="single"/>
-              <w:bottom w:color="000000" w:space="0" w:sz="4" w:val="single"/>
-              <w:right w:color="000000" w:space="0" w:sz="4" w:val="single"/>
-            </w:tcBorders>
-            <w:tcMar>
-              <w:top w:w="50.0" w:type="dxa"/>
-              <w:left w:w="100.0" w:type="dxa"/>
-              <w:bottom w:w="50.0" w:type="dxa"/>
-              <w:right w:w="100.0" w:type="dxa"/>
-            </w:tcMar>
-            <w:vAlign w:val="top"/>
-          </w:tcPr>
-          <w:p>
-            <w:pPr>
-              <w:spacing w:after="20" w:lineRule="auto"/>
-              <w:rPr/>
-            </w:pPr>
-            <w:r>
-              <w:rPr>
-                <w:rFonts w:ascii="Arial" w:cs="Arial" w:eastAsia="Arial" w:hAnsi="Arial"/>
-                <w:sz w:val="21"/>
-                <w:szCs w:val="21"/>
-                <w:rtl w:val="0"/>
-              </w:rPr>
-              <w:t xml:space="preserve">Portabilidad a web</w:t>
-            </w:r>
-            <w:r>
-              <w:rPr>
-                <w:rtl w:val="0"/>
-              </w:rPr>
-            </w:r>
-          </w:p>
-        </w:tc>
-        <w:tc>
-          <w:tcPr>
-            <w:tcBorders>
-              <w:top w:color="000000" w:space="0" w:sz="4" w:val="single"/>
-              <w:left w:color="000000" w:space="0" w:sz="4" w:val="single"/>
-              <w:bottom w:color="000000" w:space="0" w:sz="4" w:val="single"/>
-              <w:right w:color="000000" w:space="0" w:sz="4" w:val="single"/>
-            </w:tcBorders>
-            <w:tcMar>
-              <w:top w:w="50.0" w:type="dxa"/>
-              <w:left w:w="100.0" w:type="dxa"/>
-              <w:bottom w:w="50.0" w:type="dxa"/>
-              <w:right w:w="100.0" w:type="dxa"/>
-            </w:tcMar>
-            <w:vAlign w:val="top"/>
-          </w:tcPr>
-          <w:p>
-            <w:pPr>
-              <w:spacing w:after="20" w:lineRule="auto"/>
-              <w:rPr/>
-            </w:pPr>
-            <w:r>
-              <w:rPr>
-                <w:rFonts w:ascii="Arial" w:cs="Arial" w:eastAsia="Arial" w:hAnsi="Arial"/>
-                <w:sz w:val="21"/>
-                <w:szCs w:val="21"/>
-                <w:rtl w:val="0"/>
-              </w:rPr>
-              <w:t xml:space="preserve">Lógica en servicios, separada de la presentación (apartados 3.3 y 4.1)</w:t>
+              <w:t xml:space="preserve">RNF-12</w:t>
+            </w:r>
+            <w:r>
+              <w:rPr>
+                <w:rtl w:val="0"/>
+              </w:rPr>
+            </w:r>
+          </w:p>
+        </w:tc>
+        <w:tc>
+          <w:tcPr>
+            <w:tcBorders>
+              <w:top w:color="000000" w:space="0" w:sz="4" w:val="single"/>
+              <w:left w:color="000000" w:space="0" w:sz="4" w:val="single"/>
+              <w:bottom w:color="000000" w:space="0" w:sz="4" w:val="single"/>
+              <w:right w:color="000000" w:space="0" w:sz="4" w:val="single"/>
+            </w:tcBorders>
+            <w:tcMar>
+              <w:top w:w="50.0" w:type="dxa"/>
+              <w:left w:w="100.0" w:type="dxa"/>
+              <w:bottom w:w="50.0" w:type="dxa"/>
+              <w:right w:w="100.0" w:type="dxa"/>
+            </w:tcMar>
+            <w:vAlign w:val="top"/>
+          </w:tcPr>
+          <w:p>
+            <w:pPr>
+              <w:spacing w:after="20" w:lineRule="auto"/>
+              <w:rPr/>
+            </w:pPr>
+            <w:r>
+              <w:rPr>
+                <w:rFonts w:ascii="Arial" w:cs="Arial" w:eastAsia="Arial" w:hAnsi="Arial"/>
+                <w:sz w:val="21"/>
+                <w:szCs w:val="21"/>
+                <w:rtl w:val="0"/>
+              </w:rPr>
+              <w:t xml:space="preserve">Accesibilidad</w:t>
+            </w:r>
+            <w:r>
+              <w:rPr>
+                <w:rtl w:val="0"/>
+              </w:rPr>
+            </w:r>
+          </w:p>
+        </w:tc>
+        <w:tc>
+          <w:tcPr>
+            <w:tcBorders>
+              <w:top w:color="000000" w:space="0" w:sz="4" w:val="single"/>
+              <w:left w:color="000000" w:space="0" w:sz="4" w:val="single"/>
+              <w:bottom w:color="000000" w:space="0" w:sz="4" w:val="single"/>
+              <w:right w:color="000000" w:space="0" w:sz="4" w:val="single"/>
+            </w:tcBorders>
+            <w:tcMar>
+              <w:top w:w="50.0" w:type="dxa"/>
+              <w:left w:w="100.0" w:type="dxa"/>
+              <w:bottom w:w="50.0" w:type="dxa"/>
+              <w:right w:w="100.0" w:type="dxa"/>
+            </w:tcMar>
+            <w:vAlign w:val="top"/>
+          </w:tcPr>
+          <w:p>
+            <w:pPr>
+              <w:spacing w:after="20" w:lineRule="auto"/>
+              <w:rPr/>
+            </w:pPr>
+            <w:r>
+              <w:rPr>
+                <w:rFonts w:ascii="Arial" w:cs="Arial" w:eastAsia="Arial" w:hAnsi="Arial"/>
+                <w:sz w:val="21"/>
+                <w:szCs w:val="21"/>
+                <w:rtl w:val="0"/>
+              </w:rPr>
+              <w:t xml:space="preserve">Contraste AA y tipografías definidas (apartado 5.3)</w:t>
             </w:r>
             <w:r>
               <w:rPr>
@@ -18501,198 +19436,81 @@
                 <w:szCs w:val="21"/>
                 <w:rtl w:val="0"/>
               </w:rPr>
-              <w:t xml:space="preserve">RNF-12</w:t>
-            </w:r>
-            <w:r>
-              <w:rPr>
-                <w:rtl w:val="0"/>
-              </w:rPr>
-            </w:r>
-          </w:p>
-        </w:tc>
-        <w:tc>
-          <w:tcPr>
-            <w:tcBorders>
-              <w:top w:color="000000" w:space="0" w:sz="4" w:val="single"/>
-              <w:left w:color="000000" w:space="0" w:sz="4" w:val="single"/>
-              <w:bottom w:color="000000" w:space="0" w:sz="4" w:val="single"/>
-              <w:right w:color="000000" w:space="0" w:sz="4" w:val="single"/>
-            </w:tcBorders>
-            <w:tcMar>
-              <w:top w:w="50.0" w:type="dxa"/>
-              <w:left w:w="100.0" w:type="dxa"/>
-              <w:bottom w:w="50.0" w:type="dxa"/>
-              <w:right w:w="100.0" w:type="dxa"/>
-            </w:tcMar>
-            <w:vAlign w:val="top"/>
-          </w:tcPr>
-          <w:p>
-            <w:pPr>
-              <w:spacing w:after="20" w:lineRule="auto"/>
-              <w:rPr/>
-            </w:pPr>
-            <w:r>
-              <w:rPr>
-                <w:rFonts w:ascii="Arial" w:cs="Arial" w:eastAsia="Arial" w:hAnsi="Arial"/>
-                <w:sz w:val="21"/>
-                <w:szCs w:val="21"/>
-                <w:rtl w:val="0"/>
-              </w:rPr>
-              <w:t xml:space="preserve">Accesibilidad</w:t>
-            </w:r>
-            <w:r>
-              <w:rPr>
-                <w:rtl w:val="0"/>
-              </w:rPr>
-            </w:r>
-          </w:p>
-        </w:tc>
-        <w:tc>
-          <w:tcPr>
-            <w:tcBorders>
-              <w:top w:color="000000" w:space="0" w:sz="4" w:val="single"/>
-              <w:left w:color="000000" w:space="0" w:sz="4" w:val="single"/>
-              <w:bottom w:color="000000" w:space="0" w:sz="4" w:val="single"/>
-              <w:right w:color="000000" w:space="0" w:sz="4" w:val="single"/>
-            </w:tcBorders>
-            <w:tcMar>
-              <w:top w:w="50.0" w:type="dxa"/>
-              <w:left w:w="100.0" w:type="dxa"/>
-              <w:bottom w:w="50.0" w:type="dxa"/>
-              <w:right w:w="100.0" w:type="dxa"/>
-            </w:tcMar>
-            <w:vAlign w:val="top"/>
-          </w:tcPr>
-          <w:p>
-            <w:pPr>
-              <w:spacing w:after="20" w:lineRule="auto"/>
-              <w:rPr/>
-            </w:pPr>
-            <w:r>
-              <w:rPr>
-                <w:rFonts w:ascii="Arial" w:cs="Arial" w:eastAsia="Arial" w:hAnsi="Arial"/>
-                <w:sz w:val="21"/>
-                <w:szCs w:val="21"/>
-                <w:rtl w:val="0"/>
-              </w:rPr>
-              <w:t xml:space="preserve">Contraste AA y tipografías definidas (apartado 5.3)</w:t>
-            </w:r>
-            <w:r>
-              <w:rPr>
-                <w:rtl w:val="0"/>
-              </w:rPr>
-            </w:r>
-          </w:p>
-        </w:tc>
-      </w:tr>
-      <w:tr>
-        <w:trPr>
-          <w:cantSplit w:val="1"/>
-          <w:tblHeader w:val="0"/>
-        </w:trPr>
-        <w:tc>
-          <w:tcPr>
-            <w:tcBorders>
-              <w:top w:color="000000" w:space="0" w:sz="4" w:val="single"/>
-              <w:left w:color="000000" w:space="0" w:sz="4" w:val="single"/>
-              <w:bottom w:color="000000" w:space="0" w:sz="4" w:val="single"/>
-              <w:right w:color="000000" w:space="0" w:sz="4" w:val="single"/>
-            </w:tcBorders>
-            <w:tcMar>
-              <w:top w:w="50.0" w:type="dxa"/>
-              <w:left w:w="100.0" w:type="dxa"/>
-              <w:bottom w:w="50.0" w:type="dxa"/>
-              <w:right w:w="100.0" w:type="dxa"/>
-            </w:tcMar>
-            <w:vAlign w:val="top"/>
-          </w:tcPr>
-          <w:p>
-            <w:pPr>
-              <w:spacing w:after="20" w:lineRule="auto"/>
-              <w:rPr/>
-            </w:pPr>
-            <w:r>
-              <w:rPr>
-                <w:rFonts w:ascii="Arial" w:cs="Arial" w:eastAsia="Arial" w:hAnsi="Arial"/>
-                <w:sz w:val="21"/>
-                <w:szCs w:val="21"/>
-                <w:rtl w:val="0"/>
-              </w:rPr>
-              <w:t xml:space="preserve">RNF-14</w:t>
-            </w:r>
-            <w:r>
-              <w:rPr>
-                <w:rtl w:val="0"/>
-              </w:rPr>
-            </w:r>
-          </w:p>
-        </w:tc>
-        <w:tc>
-          <w:tcPr>
-            <w:tcBorders>
-              <w:top w:color="000000" w:space="0" w:sz="4" w:val="single"/>
-              <w:left w:color="000000" w:space="0" w:sz="4" w:val="single"/>
-              <w:bottom w:color="000000" w:space="0" w:sz="4" w:val="single"/>
-              <w:right w:color="000000" w:space="0" w:sz="4" w:val="single"/>
-            </w:tcBorders>
-            <w:tcMar>
-              <w:top w:w="50.0" w:type="dxa"/>
-              <w:left w:w="100.0" w:type="dxa"/>
-              <w:bottom w:w="50.0" w:type="dxa"/>
-              <w:right w:w="100.0" w:type="dxa"/>
-            </w:tcMar>
-            <w:vAlign w:val="top"/>
-          </w:tcPr>
-          <w:p>
-            <w:pPr>
-              <w:spacing w:after="20" w:lineRule="auto"/>
-              <w:rPr/>
-            </w:pPr>
-            <w:r>
-              <w:rPr>
-                <w:rFonts w:ascii="Arial" w:cs="Arial" w:eastAsia="Arial" w:hAnsi="Arial"/>
-                <w:sz w:val="21"/>
-                <w:szCs w:val="21"/>
-                <w:rtl w:val="0"/>
-              </w:rPr>
-              <w:t xml:space="preserve">Uso de recursos</w:t>
-            </w:r>
-            <w:r>
-              <w:rPr>
-                <w:rtl w:val="0"/>
-              </w:rPr>
-            </w:r>
-          </w:p>
-        </w:tc>
-        <w:tc>
-          <w:tcPr>
-            <w:tcBorders>
-              <w:top w:color="000000" w:space="0" w:sz="4" w:val="single"/>
-              <w:left w:color="000000" w:space="0" w:sz="4" w:val="single"/>
-              <w:bottom w:color="000000" w:space="0" w:sz="4" w:val="single"/>
-              <w:right w:color="000000" w:space="0" w:sz="4" w:val="single"/>
-            </w:tcBorders>
-            <w:tcMar>
-              <w:top w:w="50.0" w:type="dxa"/>
-              <w:left w:w="100.0" w:type="dxa"/>
-              <w:bottom w:w="50.0" w:type="dxa"/>
-              <w:right w:w="100.0" w:type="dxa"/>
-            </w:tcMar>
-            <w:vAlign w:val="top"/>
-          </w:tcPr>
-          <w:p>
-            <w:pPr>
-              <w:spacing w:after="20" w:lineRule="auto"/>
-              <w:rPr/>
-            </w:pPr>
-            <w:r>
-              <w:rPr>
-                <w:rFonts w:ascii="Arial" w:cs="Arial" w:eastAsia="Arial" w:hAnsi="Arial"/>
-                <w:sz w:val="21"/>
-                <w:szCs w:val="21"/>
-                <w:rtl w:val="0"/>
-              </w:rPr>
-              <w:t xml:space="preserve">Uso responsable del servidor de teselas (apartado 2.3)</w:t>
+              <w:t xml:space="preserve">RNF-15</w:t>
+            </w:r>
+            <w:r>
+              <w:rPr>
+                <w:rtl w:val="0"/>
+              </w:rPr>
+            </w:r>
+          </w:p>
+        </w:tc>
+        <w:tc>
+          <w:tcPr>
+            <w:tcBorders>
+              <w:top w:color="000000" w:space="0" w:sz="4" w:val="single"/>
+              <w:left w:color="000000" w:space="0" w:sz="4" w:val="single"/>
+              <w:bottom w:color="000000" w:space="0" w:sz="4" w:val="single"/>
+              <w:right w:color="000000" w:space="0" w:sz="4" w:val="single"/>
+            </w:tcBorders>
+            <w:tcMar>
+              <w:top w:w="50.0" w:type="dxa"/>
+              <w:left w:w="100.0" w:type="dxa"/>
+              <w:bottom w:w="50.0" w:type="dxa"/>
+              <w:right w:w="100.0" w:type="dxa"/>
+            </w:tcMar>
+            <w:vAlign w:val="top"/>
+          </w:tcPr>
+          <w:p>
+            <w:pPr>
+              <w:spacing w:after="20" w:lineRule="auto"/>
+              <w:rPr/>
+            </w:pPr>
+            <w:r>
+              <w:rPr>
+                <w:rFonts w:ascii="Arial" w:cs="Arial" w:eastAsia="Arial" w:hAnsi="Arial"/>
+                <w:sz w:val="21"/>
+                <w:szCs w:val="21"/>
+                <w:rtl w:val="0"/>
+              </w:rPr>
+              <w:t xml:space="preserve">Permiso de ubicación explicado</w:t>
+            </w:r>
+            <w:r>
+              <w:rPr>
+                <w:rtl w:val="0"/>
+              </w:rPr>
+            </w:r>
+          </w:p>
+        </w:tc>
+        <w:tc>
+          <w:tcPr>
+            <w:tcBorders>
+              <w:top w:color="000000" w:space="0" w:sz="4" w:val="single"/>
+              <w:left w:color="000000" w:space="0" w:sz="4" w:val="single"/>
+              <w:bottom w:color="000000" w:space="0" w:sz="4" w:val="single"/>
+              <w:right w:color="000000" w:space="0" w:sz="4" w:val="single"/>
+            </w:tcBorders>
+            <w:tcMar>
+              <w:top w:w="50.0" w:type="dxa"/>
+              <w:left w:w="100.0" w:type="dxa"/>
+              <w:bottom w:w="50.0" w:type="dxa"/>
+              <w:right w:w="100.0" w:type="dxa"/>
+            </w:tcMar>
+            <w:vAlign w:val="top"/>
+          </w:tcPr>
+          <w:p>
+            <w:pPr>
+              <w:spacing w:after="20" w:lineRule="auto"/>
+              <w:rPr/>
+            </w:pPr>
+            <w:r>
+              <w:rPr>
+                <w:rFonts w:ascii="Arial" w:cs="Arial" w:eastAsia="Arial" w:hAnsi="Arial"/>
+                <w:sz w:val="21"/>
+                <w:szCs w:val="21"/>
+                <w:rtl w:val="0"/>
+              </w:rPr>
+              <w:t xml:space="preserve">Plugin de geolocalización de Capacitor (apartados 2.1 y 3.1)</w:t>
             </w:r>
             <w:r>
               <w:rPr>
@@ -18781,7 +19599,6 @@
     <w:pPr>
       <w:keepNext w:val="0"/>
       <w:keepLines w:val="0"/>
-      <w:pageBreakBefore w:val="0"/>
       <w:widowControl w:val="0"/>
       <w:pBdr>
         <w:top w:space="0" w:sz="0" w:val="nil"/>
@@ -18853,7 +19670,7 @@
               <wp:inline distB="0" distT="0" distL="0" distR="0">
                 <wp:extent cx="1428750" cy="361950"/>
                 <wp:effectExtent b="0" l="0" r="0" t="0"/>
-                <wp:docPr id="2" name="image1.png"/>
+                <wp:docPr id="3" name="image1.png"/>
                 <a:graphic>
                   <a:graphicData uri="http://schemas.openxmlformats.org/drawingml/2006/picture">
                     <pic:pic>
@@ -19367,6 +20184,20 @@
       <w:vertAlign w:val="baseline"/>
     </w:rPr>
   </w:style>
+  <w:style w:type="table" w:styleId="TableNormal" w:default="1">
+    <w:name w:val="TableNormal"/>
+    <w:tblPr>
+      <w:tblCellMar>
+        <w:top w:w="100.0" w:type="dxa"/>
+        <w:left w:w="100.0" w:type="dxa"/>
+        <w:bottom w:w="100.0" w:type="dxa"/>
+        <w:right w:w="100.0" w:type="dxa"/>
+      </w:tblCellMar>
+    </w:tblPr>
+  </w:style>
+  <w:style w:type="paragraph" w:styleId="Normal" w:default="1">
+    <w:name w:val="normal"/>
+  </w:style>
   <w:style w:type="paragraph" w:styleId="Strong">
     <w:name w:val="Strong"/>
     <w:basedOn w:val="Normal"/>
@@ -19465,6 +20296,253 @@
       <w:sz w:val="20"/>
       <w:szCs w:val="20"/>
     </w:rPr>
+  </w:style>
+  <w:style w:type="table" w:styleId="Table1">
+    <w:basedOn w:val="TableNormal"/>
+    <w:tblPr>
+      <w:tblStyleRowBandSize w:val="1"/>
+      <w:tblStyleColBandSize w:val="1"/>
+      <w:tblCellMar>
+        <w:top w:w="0.0" w:type="dxa"/>
+        <w:left w:w="115.0" w:type="dxa"/>
+        <w:bottom w:w="0.0" w:type="dxa"/>
+        <w:right w:w="115.0" w:type="dxa"/>
+      </w:tblCellMar>
+    </w:tblPr>
+  </w:style>
+  <w:style w:type="table" w:styleId="Table2">
+    <w:basedOn w:val="TableNormal"/>
+    <w:tblPr>
+      <w:tblStyleRowBandSize w:val="1"/>
+      <w:tblStyleColBandSize w:val="1"/>
+      <w:tblCellMar>
+        <w:top w:w="0.0" w:type="dxa"/>
+        <w:left w:w="115.0" w:type="dxa"/>
+        <w:bottom w:w="0.0" w:type="dxa"/>
+        <w:right w:w="115.0" w:type="dxa"/>
+      </w:tblCellMar>
+    </w:tblPr>
+  </w:style>
+  <w:style w:type="table" w:styleId="Table3">
+    <w:basedOn w:val="TableNormal"/>
+    <w:tblPr>
+      <w:tblStyleRowBandSize w:val="1"/>
+      <w:tblStyleColBandSize w:val="1"/>
+      <w:tblCellMar>
+        <w:top w:w="0.0" w:type="dxa"/>
+        <w:left w:w="115.0" w:type="dxa"/>
+        <w:bottom w:w="0.0" w:type="dxa"/>
+        <w:right w:w="115.0" w:type="dxa"/>
+      </w:tblCellMar>
+    </w:tblPr>
+  </w:style>
+  <w:style w:type="table" w:styleId="Table4">
+    <w:basedOn w:val="TableNormal"/>
+    <w:tblPr>
+      <w:tblStyleRowBandSize w:val="1"/>
+      <w:tblStyleColBandSize w:val="1"/>
+      <w:tblCellMar>
+        <w:top w:w="0.0" w:type="dxa"/>
+        <w:left w:w="115.0" w:type="dxa"/>
+        <w:bottom w:w="0.0" w:type="dxa"/>
+        <w:right w:w="115.0" w:type="dxa"/>
+      </w:tblCellMar>
+    </w:tblPr>
+  </w:style>
+  <w:style w:type="table" w:styleId="Table5">
+    <w:basedOn w:val="TableNormal"/>
+    <w:tblPr>
+      <w:tblStyleRowBandSize w:val="1"/>
+      <w:tblStyleColBandSize w:val="1"/>
+      <w:tblCellMar>
+        <w:top w:w="0.0" w:type="dxa"/>
+        <w:left w:w="115.0" w:type="dxa"/>
+        <w:bottom w:w="0.0" w:type="dxa"/>
+        <w:right w:w="115.0" w:type="dxa"/>
+      </w:tblCellMar>
+    </w:tblPr>
+  </w:style>
+  <w:style w:type="table" w:styleId="Table6">
+    <w:basedOn w:val="TableNormal"/>
+    <w:tblPr>
+      <w:tblStyleRowBandSize w:val="1"/>
+      <w:tblStyleColBandSize w:val="1"/>
+      <w:tblCellMar>
+        <w:top w:w="0.0" w:type="dxa"/>
+        <w:left w:w="115.0" w:type="dxa"/>
+        <w:bottom w:w="0.0" w:type="dxa"/>
+        <w:right w:w="115.0" w:type="dxa"/>
+      </w:tblCellMar>
+    </w:tblPr>
+  </w:style>
+  <w:style w:type="table" w:styleId="Table7">
+    <w:basedOn w:val="TableNormal"/>
+    <w:tblPr>
+      <w:tblStyleRowBandSize w:val="1"/>
+      <w:tblStyleColBandSize w:val="1"/>
+      <w:tblCellMar>
+        <w:top w:w="0.0" w:type="dxa"/>
+        <w:left w:w="115.0" w:type="dxa"/>
+        <w:bottom w:w="0.0" w:type="dxa"/>
+        <w:right w:w="115.0" w:type="dxa"/>
+      </w:tblCellMar>
+    </w:tblPr>
+  </w:style>
+  <w:style w:type="table" w:styleId="Table8">
+    <w:basedOn w:val="TableNormal"/>
+    <w:tblPr>
+      <w:tblStyleRowBandSize w:val="1"/>
+      <w:tblStyleColBandSize w:val="1"/>
+      <w:tblCellMar>
+        <w:top w:w="0.0" w:type="dxa"/>
+        <w:left w:w="115.0" w:type="dxa"/>
+        <w:bottom w:w="0.0" w:type="dxa"/>
+        <w:right w:w="115.0" w:type="dxa"/>
+      </w:tblCellMar>
+    </w:tblPr>
+  </w:style>
+  <w:style w:type="table" w:styleId="Table9">
+    <w:basedOn w:val="TableNormal"/>
+    <w:tblPr>
+      <w:tblStyleRowBandSize w:val="1"/>
+      <w:tblStyleColBandSize w:val="1"/>
+      <w:tblCellMar>
+        <w:top w:w="0.0" w:type="dxa"/>
+        <w:left w:w="115.0" w:type="dxa"/>
+        <w:bottom w:w="0.0" w:type="dxa"/>
+        <w:right w:w="115.0" w:type="dxa"/>
+      </w:tblCellMar>
+    </w:tblPr>
+  </w:style>
+  <w:style w:type="table" w:styleId="Table10">
+    <w:basedOn w:val="TableNormal"/>
+    <w:tblPr>
+      <w:tblStyleRowBandSize w:val="1"/>
+      <w:tblStyleColBandSize w:val="1"/>
+      <w:tblCellMar>
+        <w:top w:w="0.0" w:type="dxa"/>
+        <w:left w:w="115.0" w:type="dxa"/>
+        <w:bottom w:w="0.0" w:type="dxa"/>
+        <w:right w:w="115.0" w:type="dxa"/>
+      </w:tblCellMar>
+    </w:tblPr>
+  </w:style>
+  <w:style w:type="table" w:styleId="Table11">
+    <w:basedOn w:val="TableNormal"/>
+    <w:tblPr>
+      <w:tblStyleRowBandSize w:val="1"/>
+      <w:tblStyleColBandSize w:val="1"/>
+      <w:tblCellMar>
+        <w:top w:w="0.0" w:type="dxa"/>
+        <w:left w:w="115.0" w:type="dxa"/>
+        <w:bottom w:w="0.0" w:type="dxa"/>
+        <w:right w:w="115.0" w:type="dxa"/>
+      </w:tblCellMar>
+    </w:tblPr>
+  </w:style>
+  <w:style w:type="table" w:styleId="Table12">
+    <w:basedOn w:val="TableNormal"/>
+    <w:tblPr>
+      <w:tblStyleRowBandSize w:val="1"/>
+      <w:tblStyleColBandSize w:val="1"/>
+      <w:tblCellMar>
+        <w:top w:w="0.0" w:type="dxa"/>
+        <w:left w:w="115.0" w:type="dxa"/>
+        <w:bottom w:w="0.0" w:type="dxa"/>
+        <w:right w:w="115.0" w:type="dxa"/>
+      </w:tblCellMar>
+    </w:tblPr>
+  </w:style>
+  <w:style w:type="table" w:styleId="Table13">
+    <w:basedOn w:val="TableNormal"/>
+    <w:tblPr>
+      <w:tblStyleRowBandSize w:val="1"/>
+      <w:tblStyleColBandSize w:val="1"/>
+      <w:tblCellMar>
+        <w:top w:w="0.0" w:type="dxa"/>
+        <w:left w:w="115.0" w:type="dxa"/>
+        <w:bottom w:w="0.0" w:type="dxa"/>
+        <w:right w:w="115.0" w:type="dxa"/>
+      </w:tblCellMar>
+    </w:tblPr>
+  </w:style>
+  <w:style w:type="table" w:styleId="Table14">
+    <w:basedOn w:val="TableNormal"/>
+    <w:tblPr>
+      <w:tblStyleRowBandSize w:val="1"/>
+      <w:tblStyleColBandSize w:val="1"/>
+      <w:tblCellMar>
+        <w:top w:w="0.0" w:type="dxa"/>
+        <w:left w:w="115.0" w:type="dxa"/>
+        <w:bottom w:w="0.0" w:type="dxa"/>
+        <w:right w:w="115.0" w:type="dxa"/>
+      </w:tblCellMar>
+    </w:tblPr>
+  </w:style>
+  <w:style w:type="table" w:styleId="Table15">
+    <w:basedOn w:val="TableNormal"/>
+    <w:tblPr>
+      <w:tblStyleRowBandSize w:val="1"/>
+      <w:tblStyleColBandSize w:val="1"/>
+      <w:tblCellMar>
+        <w:top w:w="0.0" w:type="dxa"/>
+        <w:left w:w="115.0" w:type="dxa"/>
+        <w:bottom w:w="0.0" w:type="dxa"/>
+        <w:right w:w="115.0" w:type="dxa"/>
+      </w:tblCellMar>
+    </w:tblPr>
+  </w:style>
+  <w:style w:type="table" w:styleId="Table16">
+    <w:basedOn w:val="TableNormal"/>
+    <w:tblPr>
+      <w:tblStyleRowBandSize w:val="1"/>
+      <w:tblStyleColBandSize w:val="1"/>
+      <w:tblCellMar>
+        <w:top w:w="0.0" w:type="dxa"/>
+        <w:left w:w="115.0" w:type="dxa"/>
+        <w:bottom w:w="0.0" w:type="dxa"/>
+        <w:right w:w="115.0" w:type="dxa"/>
+      </w:tblCellMar>
+    </w:tblPr>
+  </w:style>
+  <w:style w:type="table" w:styleId="Table17">
+    <w:basedOn w:val="TableNormal"/>
+    <w:tblPr>
+      <w:tblStyleRowBandSize w:val="1"/>
+      <w:tblStyleColBandSize w:val="1"/>
+      <w:tblCellMar>
+        <w:top w:w="0.0" w:type="dxa"/>
+        <w:left w:w="115.0" w:type="dxa"/>
+        <w:bottom w:w="0.0" w:type="dxa"/>
+        <w:right w:w="115.0" w:type="dxa"/>
+      </w:tblCellMar>
+    </w:tblPr>
+  </w:style>
+  <w:style w:type="table" w:styleId="Table18">
+    <w:basedOn w:val="TableNormal"/>
+    <w:tblPr>
+      <w:tblStyleRowBandSize w:val="1"/>
+      <w:tblStyleColBandSize w:val="1"/>
+      <w:tblCellMar>
+        <w:top w:w="0.0" w:type="dxa"/>
+        <w:left w:w="115.0" w:type="dxa"/>
+        <w:bottom w:w="0.0" w:type="dxa"/>
+        <w:right w:w="115.0" w:type="dxa"/>
+      </w:tblCellMar>
+    </w:tblPr>
+  </w:style>
+  <w:style w:type="table" w:styleId="Table19">
+    <w:basedOn w:val="TableNormal"/>
+    <w:tblPr>
+      <w:tblStyleRowBandSize w:val="1"/>
+      <w:tblStyleColBandSize w:val="1"/>
+      <w:tblCellMar>
+        <w:top w:w="0.0" w:type="dxa"/>
+        <w:left w:w="115.0" w:type="dxa"/>
+        <w:bottom w:w="0.0" w:type="dxa"/>
+        <w:right w:w="115.0" w:type="dxa"/>
+      </w:tblCellMar>
+    </w:tblPr>
   </w:style>
   <w:style w:type="paragraph" w:styleId="Subtitle">
     <w:name w:val="Subtitle"/>
@@ -20057,7 +21135,7 @@
 
 <file path=customXML/item1.xml><?xml version="1.0" encoding="utf-8"?>
 <go:gDocsCustomXmlDataStorage xmlns:go="http://customooxmlschemas.google.com/" xmlns:r="http://schemas.openxmlformats.org/officeDocument/2006/relationships" uri="GoogleDocsCustomDataVersion2">
-  <go:docsCustomData xmlns:go="http://customooxmlschemas.google.com/" roundtripDataSignature="AMtx7mix3bhk0132/YPWFXaP+ZjJKjTlsA==">CgMxLjA4AHIhMUpxalFwNUJvLVpjbFgwVWJRaTJ6aV82MGVtd3U1UFB6</go:docsCustomData>
+  <go:docsCustomData xmlns:go="http://customooxmlschemas.google.com/" roundtripDataSignature="AMtx7mjem7RueF+Trqw4lNvq8sT+SP1E9Q==">CgMxLjA4AHIhMVROQXd1SjUzVFpvb2o5a2dfOWNrWl9VX0pjYnBrYXI3</go:docsCustomData>
 </go:gDocsCustomXmlDataStorage>
 </file>
 

</xml_diff>